<commit_message>
Rewrite execution section as full role-based scenarios.
Вместо примеров — сценарии входа, регистрации и работы по ролям в ЛК.

Co-authored-by: Alim Abdurakhmanov <alim-abdurakhmanov@users.noreply.github.com>
</commit_message>
<xml_diff>
--- a/docs/FinBuild-opisanie-funkcionalnyh-harakteristik.docx
+++ b/docs/FinBuild-opisanie-funkcionalnyh-harakteristik.docx
@@ -2,21 +2,86 @@
 <file path=word/document.xml><?xml version="1.0" encoding="utf-8"?>
 <w:document xmlns:wpc="http://schemas.microsoft.com/office/word/2010/wordprocessingCanvas" xmlns:mo="http://schemas.microsoft.com/office/mac/office/2008/main" xmlns:mc="http://schemas.openxmlformats.org/markup-compatibility/2006" xmlns:mv="urn:schemas-microsoft-com:mac:vml" xmlns:o="urn:schemas-microsoft-com:office:office" xmlns:r="http://schemas.openxmlformats.org/officeDocument/2006/relationships" xmlns:m="http://schemas.openxmlformats.org/officeDocument/2006/math" xmlns:v="urn:schemas-microsoft-com:vml" xmlns:wp14="http://schemas.microsoft.com/office/word/2010/wordprocessingDrawing" xmlns:wp="http://schemas.openxmlformats.org/drawingml/2006/wordprocessingDrawing" xmlns:w10="urn:schemas-microsoft-com:office:word" xmlns:w="http://schemas.openxmlformats.org/wordprocessingml/2006/main" xmlns:w14="http://schemas.microsoft.com/office/word/2010/wordml" xmlns:wpg="http://schemas.microsoft.com/office/word/2010/wordprocessingGroup" xmlns:wpi="http://schemas.microsoft.com/office/word/2010/wordprocessingInk" xmlns:wne="http://schemas.microsoft.com/office/word/2006/wordml" xmlns:wps="http://schemas.microsoft.com/office/word/2010/wordprocessingShape" mc:Ignorable="w14 wp14">
   <w:body>
-    <w:p/>
-    <w:p/>
-    <w:p/>
-    <w:p/>
-    <w:p/>
-    <w:p/>
-    <w:p/>
-    <w:p/>
+    <w:p>
+      <w:r>
+        <w:rPr>
+          <w:rFonts w:ascii="Arial" w:hAnsi="Arial" w:eastAsia="Arial"/>
+          <w:b w:val="0"/>
+          <w:sz w:val="24"/>
+        </w:rPr>
+      </w:r>
+    </w:p>
+    <w:p>
+      <w:r>
+        <w:rPr>
+          <w:rFonts w:ascii="Arial" w:hAnsi="Arial" w:eastAsia="Arial"/>
+          <w:b w:val="0"/>
+          <w:sz w:val="24"/>
+        </w:rPr>
+      </w:r>
+    </w:p>
+    <w:p>
+      <w:r>
+        <w:rPr>
+          <w:rFonts w:ascii="Arial" w:hAnsi="Arial" w:eastAsia="Arial"/>
+          <w:b w:val="0"/>
+          <w:sz w:val="24"/>
+        </w:rPr>
+      </w:r>
+    </w:p>
+    <w:p>
+      <w:r>
+        <w:rPr>
+          <w:rFonts w:ascii="Arial" w:hAnsi="Arial" w:eastAsia="Arial"/>
+          <w:b w:val="0"/>
+          <w:sz w:val="24"/>
+        </w:rPr>
+      </w:r>
+    </w:p>
+    <w:p>
+      <w:r>
+        <w:rPr>
+          <w:rFonts w:ascii="Arial" w:hAnsi="Arial" w:eastAsia="Arial"/>
+          <w:b w:val="0"/>
+          <w:sz w:val="24"/>
+        </w:rPr>
+      </w:r>
+    </w:p>
+    <w:p>
+      <w:r>
+        <w:rPr>
+          <w:rFonts w:ascii="Arial" w:hAnsi="Arial" w:eastAsia="Arial"/>
+          <w:b w:val="0"/>
+          <w:sz w:val="24"/>
+        </w:rPr>
+      </w:r>
+    </w:p>
+    <w:p>
+      <w:r>
+        <w:rPr>
+          <w:rFonts w:ascii="Arial" w:hAnsi="Arial" w:eastAsia="Arial"/>
+          <w:b w:val="0"/>
+          <w:sz w:val="24"/>
+        </w:rPr>
+      </w:r>
+    </w:p>
+    <w:p>
+      <w:r>
+        <w:rPr>
+          <w:rFonts w:ascii="Arial" w:hAnsi="Arial" w:eastAsia="Arial"/>
+          <w:b w:val="0"/>
+          <w:sz w:val="24"/>
+        </w:rPr>
+      </w:r>
+    </w:p>
     <w:p>
       <w:pPr>
+        <w:spacing w:after="0"/>
         <w:jc w:val="center"/>
       </w:pPr>
       <w:r>
         <w:rPr>
-          <w:rFonts w:ascii="Times New Roman" w:hAnsi="Times New Roman" w:eastAsia="Times New Roman"/>
+          <w:rFonts w:ascii="Arial" w:hAnsi="Arial" w:eastAsia="Arial"/>
           <w:b/>
           <w:sz w:val="28"/>
         </w:rPr>
@@ -25,36 +90,134 @@
     </w:p>
     <w:p>
       <w:pPr>
+        <w:spacing w:after="0"/>
         <w:jc w:val="center"/>
       </w:pPr>
       <w:r>
         <w:rPr>
-          <w:rFonts w:ascii="Times New Roman" w:hAnsi="Times New Roman" w:eastAsia="Times New Roman"/>
+          <w:rFonts w:ascii="Arial" w:hAnsi="Arial" w:eastAsia="Arial"/>
           <w:b/>
           <w:sz w:val="28"/>
         </w:rPr>
         <w:t>ПО «FinBuild»</w:t>
       </w:r>
     </w:p>
-    <w:p/>
-    <w:p/>
-    <w:p/>
-    <w:p/>
-    <w:p/>
-    <w:p/>
-    <w:p/>
-    <w:p/>
-    <w:p/>
-    <w:p/>
-    <w:p/>
-    <w:p/>
+    <w:p>
+      <w:r>
+        <w:rPr>
+          <w:rFonts w:ascii="Arial" w:hAnsi="Arial" w:eastAsia="Arial"/>
+          <w:b w:val="0"/>
+          <w:sz w:val="24"/>
+        </w:rPr>
+      </w:r>
+    </w:p>
+    <w:p>
+      <w:r>
+        <w:rPr>
+          <w:rFonts w:ascii="Arial" w:hAnsi="Arial" w:eastAsia="Arial"/>
+          <w:b w:val="0"/>
+          <w:sz w:val="24"/>
+        </w:rPr>
+      </w:r>
+    </w:p>
+    <w:p>
+      <w:r>
+        <w:rPr>
+          <w:rFonts w:ascii="Arial" w:hAnsi="Arial" w:eastAsia="Arial"/>
+          <w:b w:val="0"/>
+          <w:sz w:val="24"/>
+        </w:rPr>
+      </w:r>
+    </w:p>
+    <w:p>
+      <w:r>
+        <w:rPr>
+          <w:rFonts w:ascii="Arial" w:hAnsi="Arial" w:eastAsia="Arial"/>
+          <w:b w:val="0"/>
+          <w:sz w:val="24"/>
+        </w:rPr>
+      </w:r>
+    </w:p>
+    <w:p>
+      <w:r>
+        <w:rPr>
+          <w:rFonts w:ascii="Arial" w:hAnsi="Arial" w:eastAsia="Arial"/>
+          <w:b w:val="0"/>
+          <w:sz w:val="24"/>
+        </w:rPr>
+      </w:r>
+    </w:p>
+    <w:p>
+      <w:r>
+        <w:rPr>
+          <w:rFonts w:ascii="Arial" w:hAnsi="Arial" w:eastAsia="Arial"/>
+          <w:b w:val="0"/>
+          <w:sz w:val="24"/>
+        </w:rPr>
+      </w:r>
+    </w:p>
+    <w:p>
+      <w:r>
+        <w:rPr>
+          <w:rFonts w:ascii="Arial" w:hAnsi="Arial" w:eastAsia="Arial"/>
+          <w:b w:val="0"/>
+          <w:sz w:val="24"/>
+        </w:rPr>
+      </w:r>
+    </w:p>
+    <w:p>
+      <w:r>
+        <w:rPr>
+          <w:rFonts w:ascii="Arial" w:hAnsi="Arial" w:eastAsia="Arial"/>
+          <w:b w:val="0"/>
+          <w:sz w:val="24"/>
+        </w:rPr>
+      </w:r>
+    </w:p>
+    <w:p>
+      <w:r>
+        <w:rPr>
+          <w:rFonts w:ascii="Arial" w:hAnsi="Arial" w:eastAsia="Arial"/>
+          <w:b w:val="0"/>
+          <w:sz w:val="24"/>
+        </w:rPr>
+      </w:r>
+    </w:p>
+    <w:p>
+      <w:r>
+        <w:rPr>
+          <w:rFonts w:ascii="Arial" w:hAnsi="Arial" w:eastAsia="Arial"/>
+          <w:b w:val="0"/>
+          <w:sz w:val="24"/>
+        </w:rPr>
+      </w:r>
+    </w:p>
+    <w:p>
+      <w:r>
+        <w:rPr>
+          <w:rFonts w:ascii="Arial" w:hAnsi="Arial" w:eastAsia="Arial"/>
+          <w:b w:val="0"/>
+          <w:sz w:val="24"/>
+        </w:rPr>
+      </w:r>
+    </w:p>
+    <w:p>
+      <w:r>
+        <w:rPr>
+          <w:rFonts w:ascii="Arial" w:hAnsi="Arial" w:eastAsia="Arial"/>
+          <w:b w:val="0"/>
+          <w:sz w:val="24"/>
+        </w:rPr>
+      </w:r>
+    </w:p>
     <w:p>
       <w:pPr>
+        <w:spacing w:before="240" w:after="120"/>
         <w:jc w:val="both"/>
       </w:pPr>
       <w:r>
         <w:rPr>
-          <w:rFonts w:ascii="Times New Roman" w:hAnsi="Times New Roman" w:eastAsia="Times New Roman"/>
+          <w:rFonts w:ascii="Arial" w:hAnsi="Arial" w:eastAsia="Arial"/>
           <w:b/>
           <w:sz w:val="28"/>
         </w:rPr>
@@ -63,11 +226,12 @@
     </w:p>
     <w:p>
       <w:pPr>
+        <w:spacing w:after="40"/>
         <w:jc w:val="both"/>
       </w:pPr>
       <w:r>
         <w:rPr>
-          <w:rFonts w:ascii="Times New Roman" w:hAnsi="Times New Roman" w:eastAsia="Times New Roman"/>
+          <w:rFonts w:ascii="Arial" w:hAnsi="Arial" w:eastAsia="Arial"/>
           <w:b w:val="0"/>
           <w:sz w:val="24"/>
         </w:rPr>
@@ -76,11 +240,12 @@
     </w:p>
     <w:p>
       <w:pPr>
+        <w:spacing w:after="40"/>
         <w:jc w:val="both"/>
       </w:pPr>
       <w:r>
         <w:rPr>
-          <w:rFonts w:ascii="Times New Roman" w:hAnsi="Times New Roman" w:eastAsia="Times New Roman"/>
+          <w:rFonts w:ascii="Arial" w:hAnsi="Arial" w:eastAsia="Arial"/>
           <w:b w:val="0"/>
           <w:sz w:val="24"/>
         </w:rPr>
@@ -89,11 +254,12 @@
     </w:p>
     <w:p>
       <w:pPr>
+        <w:spacing w:after="40"/>
         <w:jc w:val="both"/>
       </w:pPr>
       <w:r>
         <w:rPr>
-          <w:rFonts w:ascii="Times New Roman" w:hAnsi="Times New Roman" w:eastAsia="Times New Roman"/>
+          <w:rFonts w:ascii="Arial" w:hAnsi="Arial" w:eastAsia="Arial"/>
           <w:b w:val="0"/>
           <w:sz w:val="24"/>
         </w:rPr>
@@ -102,11 +268,12 @@
     </w:p>
     <w:p>
       <w:pPr>
+        <w:spacing w:after="40"/>
         <w:jc w:val="both"/>
       </w:pPr>
       <w:r>
         <w:rPr>
-          <w:rFonts w:ascii="Times New Roman" w:hAnsi="Times New Roman" w:eastAsia="Times New Roman"/>
+          <w:rFonts w:ascii="Arial" w:hAnsi="Arial" w:eastAsia="Arial"/>
           <w:b w:val="0"/>
           <w:sz w:val="24"/>
         </w:rPr>
@@ -115,11 +282,12 @@
     </w:p>
     <w:p>
       <w:pPr>
+        <w:spacing w:after="40"/>
         <w:jc w:val="both"/>
       </w:pPr>
       <w:r>
         <w:rPr>
-          <w:rFonts w:ascii="Times New Roman" w:hAnsi="Times New Roman" w:eastAsia="Times New Roman"/>
+          <w:rFonts w:ascii="Arial" w:hAnsi="Arial" w:eastAsia="Arial"/>
           <w:b w:val="0"/>
           <w:sz w:val="24"/>
         </w:rPr>
@@ -128,11 +296,12 @@
     </w:p>
     <w:p>
       <w:pPr>
+        <w:spacing w:after="120"/>
         <w:jc w:val="both"/>
       </w:pPr>
       <w:r>
         <w:rPr>
-          <w:rFonts w:ascii="Times New Roman" w:hAnsi="Times New Roman" w:eastAsia="Times New Roman"/>
+          <w:rFonts w:ascii="Arial" w:hAnsi="Arial" w:eastAsia="Arial"/>
           <w:b w:val="0"/>
           <w:sz w:val="24"/>
         </w:rPr>
@@ -141,11 +310,12 @@
     </w:p>
     <w:p>
       <w:pPr>
+        <w:spacing w:before="240" w:after="120"/>
         <w:jc w:val="both"/>
       </w:pPr>
       <w:r>
         <w:rPr>
-          <w:rFonts w:ascii="Times New Roman" w:hAnsi="Times New Roman" w:eastAsia="Times New Roman"/>
+          <w:rFonts w:ascii="Arial" w:hAnsi="Arial" w:eastAsia="Arial"/>
           <w:b/>
           <w:sz w:val="28"/>
         </w:rPr>
@@ -154,11 +324,13 @@
     </w:p>
     <w:p>
       <w:pPr>
+        <w:spacing w:after="120"/>
+        <w:ind w:firstLine="709"/>
         <w:jc w:val="both"/>
       </w:pPr>
       <w:r>
         <w:rPr>
-          <w:rFonts w:ascii="Times New Roman" w:hAnsi="Times New Roman" w:eastAsia="Times New Roman"/>
+          <w:rFonts w:ascii="Arial" w:hAnsi="Arial" w:eastAsia="Arial"/>
           <w:b w:val="0"/>
           <w:sz w:val="24"/>
         </w:rPr>
@@ -167,11 +339,12 @@
     </w:p>
     <w:p>
       <w:pPr>
+        <w:spacing w:before="240" w:after="120"/>
         <w:jc w:val="both"/>
       </w:pPr>
       <w:r>
         <w:rPr>
-          <w:rFonts w:ascii="Times New Roman" w:hAnsi="Times New Roman" w:eastAsia="Times New Roman"/>
+          <w:rFonts w:ascii="Arial" w:hAnsi="Arial" w:eastAsia="Arial"/>
           <w:b/>
           <w:sz w:val="28"/>
         </w:rPr>
@@ -180,11 +353,13 @@
     </w:p>
     <w:p>
       <w:pPr>
+        <w:spacing w:after="120"/>
+        <w:ind w:firstLine="709"/>
         <w:jc w:val="both"/>
       </w:pPr>
       <w:r>
         <w:rPr>
-          <w:rFonts w:ascii="Times New Roman" w:hAnsi="Times New Roman" w:eastAsia="Times New Roman"/>
+          <w:rFonts w:ascii="Arial" w:hAnsi="Arial" w:eastAsia="Arial"/>
           <w:b w:val="0"/>
           <w:sz w:val="24"/>
         </w:rPr>
@@ -193,11 +368,13 @@
     </w:p>
     <w:p>
       <w:pPr>
+        <w:spacing w:after="120"/>
+        <w:ind w:firstLine="709"/>
         <w:jc w:val="both"/>
       </w:pPr>
       <w:r>
         <w:rPr>
-          <w:rFonts w:ascii="Times New Roman" w:hAnsi="Times New Roman" w:eastAsia="Times New Roman"/>
+          <w:rFonts w:ascii="Arial" w:hAnsi="Arial" w:eastAsia="Arial"/>
           <w:b w:val="0"/>
           <w:sz w:val="24"/>
         </w:rPr>
@@ -206,11 +383,12 @@
     </w:p>
     <w:p>
       <w:pPr>
+        <w:spacing w:before="240" w:after="120"/>
         <w:jc w:val="both"/>
       </w:pPr>
       <w:r>
         <w:rPr>
-          <w:rFonts w:ascii="Times New Roman" w:hAnsi="Times New Roman" w:eastAsia="Times New Roman"/>
+          <w:rFonts w:ascii="Arial" w:hAnsi="Arial" w:eastAsia="Arial"/>
           <w:b/>
           <w:sz w:val="28"/>
         </w:rPr>
@@ -219,11 +397,13 @@
     </w:p>
     <w:p>
       <w:pPr>
+        <w:spacing w:after="80"/>
+        <w:ind w:firstLine="709"/>
         <w:jc w:val="both"/>
       </w:pPr>
       <w:r>
         <w:rPr>
-          <w:rFonts w:ascii="Times New Roman" w:hAnsi="Times New Roman" w:eastAsia="Times New Roman"/>
+          <w:rFonts w:ascii="Arial" w:hAnsi="Arial" w:eastAsia="Arial"/>
           <w:b w:val="0"/>
           <w:sz w:val="24"/>
         </w:rPr>
@@ -232,11 +412,14 @@
     </w:p>
     <w:p>
       <w:pPr>
+        <w:pStyle w:val="ListBullet"/>
+        <w:spacing w:after="40"/>
+        <w:ind w:firstLine="0" w:left="709"/>
         <w:jc w:val="both"/>
       </w:pPr>
       <w:r>
         <w:rPr>
-          <w:rFonts w:ascii="Times New Roman" w:hAnsi="Times New Roman" w:eastAsia="Times New Roman"/>
+          <w:rFonts w:ascii="Arial" w:hAnsi="Arial" w:eastAsia="Arial"/>
           <w:b w:val="0"/>
           <w:sz w:val="24"/>
         </w:rPr>
@@ -245,11 +428,14 @@
     </w:p>
     <w:p>
       <w:pPr>
+        <w:pStyle w:val="ListBullet"/>
+        <w:spacing w:after="40"/>
+        <w:ind w:firstLine="0" w:left="709"/>
         <w:jc w:val="both"/>
       </w:pPr>
       <w:r>
         <w:rPr>
-          <w:rFonts w:ascii="Times New Roman" w:hAnsi="Times New Roman" w:eastAsia="Times New Roman"/>
+          <w:rFonts w:ascii="Arial" w:hAnsi="Arial" w:eastAsia="Arial"/>
           <w:b w:val="0"/>
           <w:sz w:val="24"/>
         </w:rPr>
@@ -258,11 +444,14 @@
     </w:p>
     <w:p>
       <w:pPr>
+        <w:pStyle w:val="ListBullet"/>
+        <w:spacing w:after="40"/>
+        <w:ind w:firstLine="0" w:left="709"/>
         <w:jc w:val="both"/>
       </w:pPr>
       <w:r>
         <w:rPr>
-          <w:rFonts w:ascii="Times New Roman" w:hAnsi="Times New Roman" w:eastAsia="Times New Roman"/>
+          <w:rFonts w:ascii="Arial" w:hAnsi="Arial" w:eastAsia="Arial"/>
           <w:b w:val="0"/>
           <w:sz w:val="24"/>
         </w:rPr>
@@ -271,11 +460,14 @@
     </w:p>
     <w:p>
       <w:pPr>
+        <w:pStyle w:val="ListBullet"/>
+        <w:spacing w:after="40"/>
+        <w:ind w:firstLine="0" w:left="709"/>
         <w:jc w:val="both"/>
       </w:pPr>
       <w:r>
         <w:rPr>
-          <w:rFonts w:ascii="Times New Roman" w:hAnsi="Times New Roman" w:eastAsia="Times New Roman"/>
+          <w:rFonts w:ascii="Arial" w:hAnsi="Arial" w:eastAsia="Arial"/>
           <w:b w:val="0"/>
           <w:sz w:val="24"/>
         </w:rPr>
@@ -284,11 +476,14 @@
     </w:p>
     <w:p>
       <w:pPr>
+        <w:pStyle w:val="ListBullet"/>
+        <w:spacing w:after="40"/>
+        <w:ind w:firstLine="0" w:left="709"/>
         <w:jc w:val="both"/>
       </w:pPr>
       <w:r>
         <w:rPr>
-          <w:rFonts w:ascii="Times New Roman" w:hAnsi="Times New Roman" w:eastAsia="Times New Roman"/>
+          <w:rFonts w:ascii="Arial" w:hAnsi="Arial" w:eastAsia="Arial"/>
           <w:b w:val="0"/>
           <w:sz w:val="24"/>
         </w:rPr>
@@ -297,11 +492,14 @@
     </w:p>
     <w:p>
       <w:pPr>
+        <w:pStyle w:val="ListBullet"/>
+        <w:spacing w:after="40"/>
+        <w:ind w:firstLine="0" w:left="709"/>
         <w:jc w:val="both"/>
       </w:pPr>
       <w:r>
         <w:rPr>
-          <w:rFonts w:ascii="Times New Roman" w:hAnsi="Times New Roman" w:eastAsia="Times New Roman"/>
+          <w:rFonts w:ascii="Arial" w:hAnsi="Arial" w:eastAsia="Arial"/>
           <w:b w:val="0"/>
           <w:sz w:val="24"/>
         </w:rPr>
@@ -310,11 +508,14 @@
     </w:p>
     <w:p>
       <w:pPr>
+        <w:pStyle w:val="ListBullet"/>
+        <w:spacing w:after="40"/>
+        <w:ind w:firstLine="0" w:left="709"/>
         <w:jc w:val="both"/>
       </w:pPr>
       <w:r>
         <w:rPr>
-          <w:rFonts w:ascii="Times New Roman" w:hAnsi="Times New Roman" w:eastAsia="Times New Roman"/>
+          <w:rFonts w:ascii="Arial" w:hAnsi="Arial" w:eastAsia="Arial"/>
           <w:b w:val="0"/>
           <w:sz w:val="24"/>
         </w:rPr>
@@ -323,11 +524,14 @@
     </w:p>
     <w:p>
       <w:pPr>
+        <w:pStyle w:val="ListBullet"/>
+        <w:spacing w:after="40"/>
+        <w:ind w:firstLine="0" w:left="709"/>
         <w:jc w:val="both"/>
       </w:pPr>
       <w:r>
         <w:rPr>
-          <w:rFonts w:ascii="Times New Roman" w:hAnsi="Times New Roman" w:eastAsia="Times New Roman"/>
+          <w:rFonts w:ascii="Arial" w:hAnsi="Arial" w:eastAsia="Arial"/>
           <w:b w:val="0"/>
           <w:sz w:val="24"/>
         </w:rPr>
@@ -336,11 +540,14 @@
     </w:p>
     <w:p>
       <w:pPr>
+        <w:pStyle w:val="ListBullet"/>
+        <w:spacing w:after="40"/>
+        <w:ind w:firstLine="0" w:left="709"/>
         <w:jc w:val="both"/>
       </w:pPr>
       <w:r>
         <w:rPr>
-          <w:rFonts w:ascii="Times New Roman" w:hAnsi="Times New Roman" w:eastAsia="Times New Roman"/>
+          <w:rFonts w:ascii="Arial" w:hAnsi="Arial" w:eastAsia="Arial"/>
           <w:b w:val="0"/>
           <w:sz w:val="24"/>
         </w:rPr>
@@ -349,11 +556,14 @@
     </w:p>
     <w:p>
       <w:pPr>
+        <w:pStyle w:val="ListBullet"/>
+        <w:spacing w:after="40"/>
+        <w:ind w:firstLine="0" w:left="709"/>
         <w:jc w:val="both"/>
       </w:pPr>
       <w:r>
         <w:rPr>
-          <w:rFonts w:ascii="Times New Roman" w:hAnsi="Times New Roman" w:eastAsia="Times New Roman"/>
+          <w:rFonts w:ascii="Arial" w:hAnsi="Arial" w:eastAsia="Arial"/>
           <w:b w:val="0"/>
           <w:sz w:val="24"/>
         </w:rPr>
@@ -362,11 +572,14 @@
     </w:p>
     <w:p>
       <w:pPr>
+        <w:pStyle w:val="ListBullet"/>
+        <w:spacing w:after="40"/>
+        <w:ind w:firstLine="0" w:left="709"/>
         <w:jc w:val="both"/>
       </w:pPr>
       <w:r>
         <w:rPr>
-          <w:rFonts w:ascii="Times New Roman" w:hAnsi="Times New Roman" w:eastAsia="Times New Roman"/>
+          <w:rFonts w:ascii="Arial" w:hAnsi="Arial" w:eastAsia="Arial"/>
           <w:b w:val="0"/>
           <w:sz w:val="24"/>
         </w:rPr>
@@ -375,11 +588,14 @@
     </w:p>
     <w:p>
       <w:pPr>
+        <w:pStyle w:val="ListBullet"/>
+        <w:spacing w:after="40"/>
+        <w:ind w:firstLine="0" w:left="709"/>
         <w:jc w:val="both"/>
       </w:pPr>
       <w:r>
         <w:rPr>
-          <w:rFonts w:ascii="Times New Roman" w:hAnsi="Times New Roman" w:eastAsia="Times New Roman"/>
+          <w:rFonts w:ascii="Arial" w:hAnsi="Arial" w:eastAsia="Arial"/>
           <w:b w:val="0"/>
           <w:sz w:val="24"/>
         </w:rPr>
@@ -388,11 +604,14 @@
     </w:p>
     <w:p>
       <w:pPr>
+        <w:pStyle w:val="ListBullet"/>
+        <w:spacing w:after="40"/>
+        <w:ind w:firstLine="0" w:left="709"/>
         <w:jc w:val="both"/>
       </w:pPr>
       <w:r>
         <w:rPr>
-          <w:rFonts w:ascii="Times New Roman" w:hAnsi="Times New Roman" w:eastAsia="Times New Roman"/>
+          <w:rFonts w:ascii="Arial" w:hAnsi="Arial" w:eastAsia="Arial"/>
           <w:b w:val="0"/>
           <w:sz w:val="24"/>
         </w:rPr>
@@ -401,11 +620,14 @@
     </w:p>
     <w:p>
       <w:pPr>
+        <w:pStyle w:val="ListBullet"/>
+        <w:spacing w:after="40"/>
+        <w:ind w:firstLine="0" w:left="709"/>
         <w:jc w:val="both"/>
       </w:pPr>
       <w:r>
         <w:rPr>
-          <w:rFonts w:ascii="Times New Roman" w:hAnsi="Times New Roman" w:eastAsia="Times New Roman"/>
+          <w:rFonts w:ascii="Arial" w:hAnsi="Arial" w:eastAsia="Arial"/>
           <w:b w:val="0"/>
           <w:sz w:val="24"/>
         </w:rPr>
@@ -414,11 +636,14 @@
     </w:p>
     <w:p>
       <w:pPr>
+        <w:pStyle w:val="ListBullet"/>
+        <w:spacing w:after="40"/>
+        <w:ind w:firstLine="0" w:left="709"/>
         <w:jc w:val="both"/>
       </w:pPr>
       <w:r>
         <w:rPr>
-          <w:rFonts w:ascii="Times New Roman" w:hAnsi="Times New Roman" w:eastAsia="Times New Roman"/>
+          <w:rFonts w:ascii="Arial" w:hAnsi="Arial" w:eastAsia="Arial"/>
           <w:b w:val="0"/>
           <w:sz w:val="24"/>
         </w:rPr>
@@ -427,11 +652,14 @@
     </w:p>
     <w:p>
       <w:pPr>
+        <w:pStyle w:val="ListBullet"/>
+        <w:spacing w:after="40"/>
+        <w:ind w:firstLine="0" w:left="709"/>
         <w:jc w:val="both"/>
       </w:pPr>
       <w:r>
         <w:rPr>
-          <w:rFonts w:ascii="Times New Roman" w:hAnsi="Times New Roman" w:eastAsia="Times New Roman"/>
+          <w:rFonts w:ascii="Arial" w:hAnsi="Arial" w:eastAsia="Arial"/>
           <w:b w:val="0"/>
           <w:sz w:val="24"/>
         </w:rPr>
@@ -440,11 +668,14 @@
     </w:p>
     <w:p>
       <w:pPr>
+        <w:pStyle w:val="ListBullet"/>
+        <w:spacing w:after="40"/>
+        <w:ind w:firstLine="0" w:left="709"/>
         <w:jc w:val="both"/>
       </w:pPr>
       <w:r>
         <w:rPr>
-          <w:rFonts w:ascii="Times New Roman" w:hAnsi="Times New Roman" w:eastAsia="Times New Roman"/>
+          <w:rFonts w:ascii="Arial" w:hAnsi="Arial" w:eastAsia="Arial"/>
           <w:b w:val="0"/>
           <w:sz w:val="24"/>
         </w:rPr>
@@ -453,11 +684,14 @@
     </w:p>
     <w:p>
       <w:pPr>
+        <w:pStyle w:val="ListBullet"/>
+        <w:spacing w:after="40"/>
+        <w:ind w:firstLine="0" w:left="709"/>
         <w:jc w:val="both"/>
       </w:pPr>
       <w:r>
         <w:rPr>
-          <w:rFonts w:ascii="Times New Roman" w:hAnsi="Times New Roman" w:eastAsia="Times New Roman"/>
+          <w:rFonts w:ascii="Arial" w:hAnsi="Arial" w:eastAsia="Arial"/>
           <w:b w:val="0"/>
           <w:sz w:val="24"/>
         </w:rPr>
@@ -466,11 +700,12 @@
     </w:p>
     <w:p>
       <w:pPr>
+        <w:spacing w:before="240" w:after="120"/>
         <w:jc w:val="both"/>
       </w:pPr>
       <w:r>
         <w:rPr>
-          <w:rFonts w:ascii="Times New Roman" w:hAnsi="Times New Roman" w:eastAsia="Times New Roman"/>
+          <w:rFonts w:ascii="Arial" w:hAnsi="Arial" w:eastAsia="Arial"/>
           <w:b/>
           <w:sz w:val="28"/>
         </w:rPr>
@@ -479,11 +714,13 @@
     </w:p>
     <w:p>
       <w:pPr>
+        <w:spacing w:after="80"/>
+        <w:ind w:firstLine="709"/>
         <w:jc w:val="both"/>
       </w:pPr>
       <w:r>
         <w:rPr>
-          <w:rFonts w:ascii="Times New Roman" w:hAnsi="Times New Roman" w:eastAsia="Times New Roman"/>
+          <w:rFonts w:ascii="Arial" w:hAnsi="Arial" w:eastAsia="Arial"/>
           <w:b w:val="0"/>
           <w:sz w:val="24"/>
         </w:rPr>
@@ -492,11 +729,13 @@
     </w:p>
     <w:p>
       <w:pPr>
+        <w:spacing w:after="80"/>
+        <w:ind w:firstLine="709"/>
         <w:jc w:val="both"/>
       </w:pPr>
       <w:r>
         <w:rPr>
-          <w:rFonts w:ascii="Times New Roman" w:hAnsi="Times New Roman" w:eastAsia="Times New Roman"/>
+          <w:rFonts w:ascii="Arial" w:hAnsi="Arial" w:eastAsia="Arial"/>
           <w:b w:val="0"/>
           <w:sz w:val="24"/>
         </w:rPr>
@@ -505,11 +744,13 @@
     </w:p>
     <w:p>
       <w:pPr>
+        <w:spacing w:after="80"/>
+        <w:ind w:firstLine="709"/>
         <w:jc w:val="both"/>
       </w:pPr>
       <w:r>
         <w:rPr>
-          <w:rFonts w:ascii="Times New Roman" w:hAnsi="Times New Roman" w:eastAsia="Times New Roman"/>
+          <w:rFonts w:ascii="Arial" w:hAnsi="Arial" w:eastAsia="Arial"/>
           <w:b w:val="0"/>
           <w:sz w:val="24"/>
         </w:rPr>
@@ -518,11 +759,13 @@
     </w:p>
     <w:p>
       <w:pPr>
+        <w:spacing w:after="80"/>
+        <w:ind w:firstLine="709"/>
         <w:jc w:val="both"/>
       </w:pPr>
       <w:r>
         <w:rPr>
-          <w:rFonts w:ascii="Times New Roman" w:hAnsi="Times New Roman" w:eastAsia="Times New Roman"/>
+          <w:rFonts w:ascii="Arial" w:hAnsi="Arial" w:eastAsia="Arial"/>
           <w:b w:val="0"/>
           <w:sz w:val="24"/>
         </w:rPr>
@@ -531,11 +774,13 @@
     </w:p>
     <w:p>
       <w:pPr>
+        <w:spacing w:after="80"/>
+        <w:ind w:firstLine="709"/>
         <w:jc w:val="both"/>
       </w:pPr>
       <w:r>
         <w:rPr>
-          <w:rFonts w:ascii="Times New Roman" w:hAnsi="Times New Roman" w:eastAsia="Times New Roman"/>
+          <w:rFonts w:ascii="Arial" w:hAnsi="Arial" w:eastAsia="Arial"/>
           <w:b w:val="0"/>
           <w:sz w:val="24"/>
         </w:rPr>
@@ -544,11 +789,13 @@
     </w:p>
     <w:p>
       <w:pPr>
+        <w:spacing w:after="80"/>
+        <w:ind w:firstLine="709"/>
         <w:jc w:val="both"/>
       </w:pPr>
       <w:r>
         <w:rPr>
-          <w:rFonts w:ascii="Times New Roman" w:hAnsi="Times New Roman" w:eastAsia="Times New Roman"/>
+          <w:rFonts w:ascii="Arial" w:hAnsi="Arial" w:eastAsia="Arial"/>
           <w:b w:val="0"/>
           <w:sz w:val="24"/>
         </w:rPr>
@@ -557,11 +804,13 @@
     </w:p>
     <w:p>
       <w:pPr>
+        <w:spacing w:after="80"/>
+        <w:ind w:firstLine="709"/>
         <w:jc w:val="both"/>
       </w:pPr>
       <w:r>
         <w:rPr>
-          <w:rFonts w:ascii="Times New Roman" w:hAnsi="Times New Roman" w:eastAsia="Times New Roman"/>
+          <w:rFonts w:ascii="Arial" w:hAnsi="Arial" w:eastAsia="Arial"/>
           <w:b w:val="0"/>
           <w:sz w:val="24"/>
         </w:rPr>
@@ -570,11 +819,13 @@
     </w:p>
     <w:p>
       <w:pPr>
+        <w:spacing w:after="80"/>
+        <w:ind w:firstLine="709"/>
         <w:jc w:val="both"/>
       </w:pPr>
       <w:r>
         <w:rPr>
-          <w:rFonts w:ascii="Times New Roman" w:hAnsi="Times New Roman" w:eastAsia="Times New Roman"/>
+          <w:rFonts w:ascii="Arial" w:hAnsi="Arial" w:eastAsia="Arial"/>
           <w:b w:val="0"/>
           <w:sz w:val="24"/>
         </w:rPr>
@@ -583,11 +834,12 @@
     </w:p>
     <w:p>
       <w:pPr>
+        <w:spacing w:before="240" w:after="120"/>
         <w:jc w:val="both"/>
       </w:pPr>
       <w:r>
         <w:rPr>
-          <w:rFonts w:ascii="Times New Roman" w:hAnsi="Times New Roman" w:eastAsia="Times New Roman"/>
+          <w:rFonts w:ascii="Arial" w:hAnsi="Arial" w:eastAsia="Arial"/>
           <w:b/>
           <w:sz w:val="28"/>
         </w:rPr>
@@ -596,11 +848,13 @@
     </w:p>
     <w:p>
       <w:pPr>
+        <w:spacing w:after="120"/>
+        <w:ind w:firstLine="709"/>
         <w:jc w:val="both"/>
       </w:pPr>
       <w:r>
         <w:rPr>
-          <w:rFonts w:ascii="Times New Roman" w:hAnsi="Times New Roman" w:eastAsia="Times New Roman"/>
+          <w:rFonts w:ascii="Arial" w:hAnsi="Arial" w:eastAsia="Arial"/>
           <w:b w:val="0"/>
           <w:sz w:val="24"/>
         </w:rPr>
@@ -609,11 +863,12 @@
     </w:p>
     <w:p>
       <w:pPr>
+        <w:spacing w:before="200" w:after="80"/>
         <w:jc w:val="both"/>
       </w:pPr>
       <w:r>
         <w:rPr>
-          <w:rFonts w:ascii="Times New Roman" w:hAnsi="Times New Roman" w:eastAsia="Times New Roman"/>
+          <w:rFonts w:ascii="Arial" w:hAnsi="Arial" w:eastAsia="Arial"/>
           <w:b/>
           <w:sz w:val="24"/>
         </w:rPr>
@@ -622,11 +877,12 @@
     </w:p>
     <w:p>
       <w:pPr>
+        <w:spacing w:after="60"/>
         <w:jc w:val="both"/>
       </w:pPr>
       <w:r>
         <w:rPr>
-          <w:rFonts w:ascii="Times New Roman" w:hAnsi="Times New Roman" w:eastAsia="Times New Roman"/>
+          <w:rFonts w:ascii="Arial" w:hAnsi="Arial" w:eastAsia="Arial"/>
           <w:b w:val="0"/>
           <w:sz w:val="24"/>
         </w:rPr>
@@ -635,11 +891,12 @@
     </w:p>
     <w:p>
       <w:pPr>
+        <w:spacing w:after="60"/>
         <w:jc w:val="both"/>
       </w:pPr>
       <w:r>
         <w:rPr>
-          <w:rFonts w:ascii="Times New Roman" w:hAnsi="Times New Roman" w:eastAsia="Times New Roman"/>
+          <w:rFonts w:ascii="Arial" w:hAnsi="Arial" w:eastAsia="Arial"/>
           <w:b w:val="0"/>
           <w:sz w:val="24"/>
         </w:rPr>
@@ -648,11 +905,12 @@
     </w:p>
     <w:p>
       <w:pPr>
+        <w:spacing w:after="60"/>
         <w:jc w:val="both"/>
       </w:pPr>
       <w:r>
         <w:rPr>
-          <w:rFonts w:ascii="Times New Roman" w:hAnsi="Times New Roman" w:eastAsia="Times New Roman"/>
+          <w:rFonts w:ascii="Arial" w:hAnsi="Arial" w:eastAsia="Arial"/>
           <w:b w:val="0"/>
           <w:sz w:val="24"/>
         </w:rPr>
@@ -661,11 +919,12 @@
     </w:p>
     <w:p>
       <w:pPr>
+        <w:spacing w:before="200" w:after="80"/>
         <w:jc w:val="both"/>
       </w:pPr>
       <w:r>
         <w:rPr>
-          <w:rFonts w:ascii="Times New Roman" w:hAnsi="Times New Roman" w:eastAsia="Times New Roman"/>
+          <w:rFonts w:ascii="Arial" w:hAnsi="Arial" w:eastAsia="Arial"/>
           <w:b/>
           <w:sz w:val="24"/>
         </w:rPr>
@@ -674,11 +933,12 @@
     </w:p>
     <w:p>
       <w:pPr>
+        <w:spacing w:after="60"/>
         <w:jc w:val="both"/>
       </w:pPr>
       <w:r>
         <w:rPr>
-          <w:rFonts w:ascii="Times New Roman" w:hAnsi="Times New Roman" w:eastAsia="Times New Roman"/>
+          <w:rFonts w:ascii="Arial" w:hAnsi="Arial" w:eastAsia="Arial"/>
           <w:b w:val="0"/>
           <w:sz w:val="24"/>
         </w:rPr>
@@ -687,11 +947,12 @@
     </w:p>
     <w:p>
       <w:pPr>
+        <w:spacing w:after="60"/>
         <w:jc w:val="both"/>
       </w:pPr>
       <w:r>
         <w:rPr>
-          <w:rFonts w:ascii="Times New Roman" w:hAnsi="Times New Roman" w:eastAsia="Times New Roman"/>
+          <w:rFonts w:ascii="Arial" w:hAnsi="Arial" w:eastAsia="Arial"/>
           <w:b w:val="0"/>
           <w:sz w:val="24"/>
         </w:rPr>
@@ -700,11 +961,12 @@
     </w:p>
     <w:p>
       <w:pPr>
+        <w:spacing w:after="60"/>
         <w:jc w:val="both"/>
       </w:pPr>
       <w:r>
         <w:rPr>
-          <w:rFonts w:ascii="Times New Roman" w:hAnsi="Times New Roman" w:eastAsia="Times New Roman"/>
+          <w:rFonts w:ascii="Arial" w:hAnsi="Arial" w:eastAsia="Arial"/>
           <w:b w:val="0"/>
           <w:sz w:val="24"/>
         </w:rPr>
@@ -713,11 +975,12 @@
     </w:p>
     <w:p>
       <w:pPr>
+        <w:spacing w:after="60"/>
         <w:jc w:val="both"/>
       </w:pPr>
       <w:r>
         <w:rPr>
-          <w:rFonts w:ascii="Times New Roman" w:hAnsi="Times New Roman" w:eastAsia="Times New Roman"/>
+          <w:rFonts w:ascii="Arial" w:hAnsi="Arial" w:eastAsia="Arial"/>
           <w:b w:val="0"/>
           <w:sz w:val="24"/>
         </w:rPr>
@@ -726,11 +989,12 @@
     </w:p>
     <w:p>
       <w:pPr>
+        <w:spacing w:before="200" w:after="80"/>
         <w:jc w:val="both"/>
       </w:pPr>
       <w:r>
         <w:rPr>
-          <w:rFonts w:ascii="Times New Roman" w:hAnsi="Times New Roman" w:eastAsia="Times New Roman"/>
+          <w:rFonts w:ascii="Arial" w:hAnsi="Arial" w:eastAsia="Arial"/>
           <w:b/>
           <w:sz w:val="24"/>
         </w:rPr>
@@ -739,11 +1003,12 @@
     </w:p>
     <w:p>
       <w:pPr>
+        <w:spacing w:after="60"/>
         <w:jc w:val="both"/>
       </w:pPr>
       <w:r>
         <w:rPr>
-          <w:rFonts w:ascii="Times New Roman" w:hAnsi="Times New Roman" w:eastAsia="Times New Roman"/>
+          <w:rFonts w:ascii="Arial" w:hAnsi="Arial" w:eastAsia="Arial"/>
           <w:b w:val="0"/>
           <w:sz w:val="24"/>
         </w:rPr>
@@ -752,11 +1017,12 @@
     </w:p>
     <w:p>
       <w:pPr>
+        <w:spacing w:after="60"/>
         <w:jc w:val="both"/>
       </w:pPr>
       <w:r>
         <w:rPr>
-          <w:rFonts w:ascii="Times New Roman" w:hAnsi="Times New Roman" w:eastAsia="Times New Roman"/>
+          <w:rFonts w:ascii="Arial" w:hAnsi="Arial" w:eastAsia="Arial"/>
           <w:b w:val="0"/>
           <w:sz w:val="24"/>
         </w:rPr>
@@ -765,11 +1031,12 @@
     </w:p>
     <w:p>
       <w:pPr>
+        <w:spacing w:after="60"/>
         <w:jc w:val="both"/>
       </w:pPr>
       <w:r>
         <w:rPr>
-          <w:rFonts w:ascii="Times New Roman" w:hAnsi="Times New Roman" w:eastAsia="Times New Roman"/>
+          <w:rFonts w:ascii="Arial" w:hAnsi="Arial" w:eastAsia="Arial"/>
           <w:b w:val="0"/>
           <w:sz w:val="24"/>
         </w:rPr>
@@ -778,11 +1045,12 @@
     </w:p>
     <w:p>
       <w:pPr>
+        <w:spacing w:before="200" w:after="80"/>
         <w:jc w:val="both"/>
       </w:pPr>
       <w:r>
         <w:rPr>
-          <w:rFonts w:ascii="Times New Roman" w:hAnsi="Times New Roman" w:eastAsia="Times New Roman"/>
+          <w:rFonts w:ascii="Arial" w:hAnsi="Arial" w:eastAsia="Arial"/>
           <w:b/>
           <w:sz w:val="24"/>
         </w:rPr>
@@ -791,11 +1059,12 @@
     </w:p>
     <w:p>
       <w:pPr>
+        <w:spacing w:after="60"/>
         <w:jc w:val="both"/>
       </w:pPr>
       <w:r>
         <w:rPr>
-          <w:rFonts w:ascii="Times New Roman" w:hAnsi="Times New Roman" w:eastAsia="Times New Roman"/>
+          <w:rFonts w:ascii="Arial" w:hAnsi="Arial" w:eastAsia="Arial"/>
           <w:b w:val="0"/>
           <w:sz w:val="24"/>
         </w:rPr>
@@ -804,11 +1073,12 @@
     </w:p>
     <w:p>
       <w:pPr>
+        <w:spacing w:after="60"/>
         <w:jc w:val="both"/>
       </w:pPr>
       <w:r>
         <w:rPr>
-          <w:rFonts w:ascii="Times New Roman" w:hAnsi="Times New Roman" w:eastAsia="Times New Roman"/>
+          <w:rFonts w:ascii="Arial" w:hAnsi="Arial" w:eastAsia="Arial"/>
           <w:b w:val="0"/>
           <w:sz w:val="24"/>
         </w:rPr>
@@ -817,11 +1087,12 @@
     </w:p>
     <w:p>
       <w:pPr>
+        <w:spacing w:after="60"/>
         <w:jc w:val="both"/>
       </w:pPr>
       <w:r>
         <w:rPr>
-          <w:rFonts w:ascii="Times New Roman" w:hAnsi="Times New Roman" w:eastAsia="Times New Roman"/>
+          <w:rFonts w:ascii="Arial" w:hAnsi="Arial" w:eastAsia="Arial"/>
           <w:b w:val="0"/>
           <w:sz w:val="24"/>
         </w:rPr>
@@ -830,11 +1101,12 @@
     </w:p>
     <w:p>
       <w:pPr>
+        <w:spacing w:after="60"/>
         <w:jc w:val="both"/>
       </w:pPr>
       <w:r>
         <w:rPr>
-          <w:rFonts w:ascii="Times New Roman" w:hAnsi="Times New Roman" w:eastAsia="Times New Roman"/>
+          <w:rFonts w:ascii="Arial" w:hAnsi="Arial" w:eastAsia="Arial"/>
           <w:b w:val="0"/>
           <w:sz w:val="24"/>
         </w:rPr>
@@ -843,11 +1115,12 @@
     </w:p>
     <w:p>
       <w:pPr>
+        <w:spacing w:before="200" w:after="80"/>
         <w:jc w:val="both"/>
       </w:pPr>
       <w:r>
         <w:rPr>
-          <w:rFonts w:ascii="Times New Roman" w:hAnsi="Times New Roman" w:eastAsia="Times New Roman"/>
+          <w:rFonts w:ascii="Arial" w:hAnsi="Arial" w:eastAsia="Arial"/>
           <w:b/>
           <w:sz w:val="24"/>
         </w:rPr>
@@ -856,11 +1129,12 @@
     </w:p>
     <w:p>
       <w:pPr>
+        <w:spacing w:after="60"/>
         <w:jc w:val="both"/>
       </w:pPr>
       <w:r>
         <w:rPr>
-          <w:rFonts w:ascii="Times New Roman" w:hAnsi="Times New Roman" w:eastAsia="Times New Roman"/>
+          <w:rFonts w:ascii="Arial" w:hAnsi="Arial" w:eastAsia="Arial"/>
           <w:b w:val="0"/>
           <w:sz w:val="24"/>
         </w:rPr>
@@ -869,11 +1143,12 @@
     </w:p>
     <w:p>
       <w:pPr>
+        <w:spacing w:after="60"/>
         <w:jc w:val="both"/>
       </w:pPr>
       <w:r>
         <w:rPr>
-          <w:rFonts w:ascii="Times New Roman" w:hAnsi="Times New Roman" w:eastAsia="Times New Roman"/>
+          <w:rFonts w:ascii="Arial" w:hAnsi="Arial" w:eastAsia="Arial"/>
           <w:b w:val="0"/>
           <w:sz w:val="24"/>
         </w:rPr>
@@ -882,11 +1157,12 @@
     </w:p>
     <w:p>
       <w:pPr>
+        <w:spacing w:after="60"/>
         <w:jc w:val="both"/>
       </w:pPr>
       <w:r>
         <w:rPr>
-          <w:rFonts w:ascii="Times New Roman" w:hAnsi="Times New Roman" w:eastAsia="Times New Roman"/>
+          <w:rFonts w:ascii="Arial" w:hAnsi="Arial" w:eastAsia="Arial"/>
           <w:b w:val="0"/>
           <w:sz w:val="24"/>
         </w:rPr>
@@ -895,11 +1171,12 @@
     </w:p>
     <w:p>
       <w:pPr>
+        <w:spacing w:before="200" w:after="80"/>
         <w:jc w:val="both"/>
       </w:pPr>
       <w:r>
         <w:rPr>
-          <w:rFonts w:ascii="Times New Roman" w:hAnsi="Times New Roman" w:eastAsia="Times New Roman"/>
+          <w:rFonts w:ascii="Arial" w:hAnsi="Arial" w:eastAsia="Arial"/>
           <w:b/>
           <w:sz w:val="24"/>
         </w:rPr>
@@ -908,11 +1185,12 @@
     </w:p>
     <w:p>
       <w:pPr>
+        <w:spacing w:after="60"/>
         <w:jc w:val="both"/>
       </w:pPr>
       <w:r>
         <w:rPr>
-          <w:rFonts w:ascii="Times New Roman" w:hAnsi="Times New Roman" w:eastAsia="Times New Roman"/>
+          <w:rFonts w:ascii="Arial" w:hAnsi="Arial" w:eastAsia="Arial"/>
           <w:b w:val="0"/>
           <w:sz w:val="24"/>
         </w:rPr>
@@ -921,11 +1199,12 @@
     </w:p>
     <w:p>
       <w:pPr>
+        <w:spacing w:after="60"/>
         <w:jc w:val="both"/>
       </w:pPr>
       <w:r>
         <w:rPr>
-          <w:rFonts w:ascii="Times New Roman" w:hAnsi="Times New Roman" w:eastAsia="Times New Roman"/>
+          <w:rFonts w:ascii="Arial" w:hAnsi="Arial" w:eastAsia="Arial"/>
           <w:b w:val="0"/>
           <w:sz w:val="24"/>
         </w:rPr>
@@ -934,11 +1213,12 @@
     </w:p>
     <w:p>
       <w:pPr>
+        <w:spacing w:after="60"/>
         <w:jc w:val="both"/>
       </w:pPr>
       <w:r>
         <w:rPr>
-          <w:rFonts w:ascii="Times New Roman" w:hAnsi="Times New Roman" w:eastAsia="Times New Roman"/>
+          <w:rFonts w:ascii="Arial" w:hAnsi="Arial" w:eastAsia="Arial"/>
           <w:b w:val="0"/>
           <w:sz w:val="24"/>
         </w:rPr>
@@ -947,11 +1227,12 @@
     </w:p>
     <w:p>
       <w:pPr>
+        <w:spacing w:before="200" w:after="80"/>
         <w:jc w:val="both"/>
       </w:pPr>
       <w:r>
         <w:rPr>
-          <w:rFonts w:ascii="Times New Roman" w:hAnsi="Times New Roman" w:eastAsia="Times New Roman"/>
+          <w:rFonts w:ascii="Arial" w:hAnsi="Arial" w:eastAsia="Arial"/>
           <w:b/>
           <w:sz w:val="24"/>
         </w:rPr>
@@ -960,11 +1241,12 @@
     </w:p>
     <w:p>
       <w:pPr>
+        <w:spacing w:after="60"/>
         <w:jc w:val="both"/>
       </w:pPr>
       <w:r>
         <w:rPr>
-          <w:rFonts w:ascii="Times New Roman" w:hAnsi="Times New Roman" w:eastAsia="Times New Roman"/>
+          <w:rFonts w:ascii="Arial" w:hAnsi="Arial" w:eastAsia="Arial"/>
           <w:b w:val="0"/>
           <w:sz w:val="24"/>
         </w:rPr>
@@ -973,11 +1255,12 @@
     </w:p>
     <w:p>
       <w:pPr>
+        <w:spacing w:after="60"/>
         <w:jc w:val="both"/>
       </w:pPr>
       <w:r>
         <w:rPr>
-          <w:rFonts w:ascii="Times New Roman" w:hAnsi="Times New Roman" w:eastAsia="Times New Roman"/>
+          <w:rFonts w:ascii="Arial" w:hAnsi="Arial" w:eastAsia="Arial"/>
           <w:b w:val="0"/>
           <w:sz w:val="24"/>
         </w:rPr>
@@ -986,11 +1269,12 @@
     </w:p>
     <w:p>
       <w:pPr>
+        <w:spacing w:after="60"/>
         <w:jc w:val="both"/>
       </w:pPr>
       <w:r>
         <w:rPr>
-          <w:rFonts w:ascii="Times New Roman" w:hAnsi="Times New Roman" w:eastAsia="Times New Roman"/>
+          <w:rFonts w:ascii="Arial" w:hAnsi="Arial" w:eastAsia="Arial"/>
           <w:b w:val="0"/>
           <w:sz w:val="24"/>
         </w:rPr>
@@ -999,11 +1283,12 @@
     </w:p>
     <w:p>
       <w:pPr>
+        <w:spacing w:before="240" w:after="120"/>
         <w:jc w:val="both"/>
       </w:pPr>
       <w:r>
         <w:rPr>
-          <w:rFonts w:ascii="Times New Roman" w:hAnsi="Times New Roman" w:eastAsia="Times New Roman"/>
+          <w:rFonts w:ascii="Arial" w:hAnsi="Arial" w:eastAsia="Arial"/>
           <w:b/>
           <w:sz w:val="28"/>
         </w:rPr>
@@ -1012,11 +1297,12 @@
     </w:p>
     <w:p>
       <w:pPr>
+        <w:spacing w:after="60"/>
         <w:jc w:val="both"/>
       </w:pPr>
       <w:r>
         <w:rPr>
-          <w:rFonts w:ascii="Times New Roman" w:hAnsi="Times New Roman" w:eastAsia="Times New Roman"/>
+          <w:rFonts w:ascii="Arial" w:hAnsi="Arial" w:eastAsia="Arial"/>
           <w:b w:val="0"/>
           <w:sz w:val="24"/>
         </w:rPr>
@@ -1029,7 +1315,7 @@
       </w:pPr>
       <w:r>
         <w:rPr>
-          <w:rFonts w:ascii="Times New Roman" w:hAnsi="Times New Roman" w:eastAsia="Times New Roman"/>
+          <w:rFonts w:ascii="Arial" w:hAnsi="Arial" w:eastAsia="Arial"/>
           <w:b/>
           <w:sz w:val="24"/>
         </w:rPr>
@@ -1037,7 +1323,7 @@
       </w:r>
       <w:r>
         <w:rPr>
-          <w:rFonts w:ascii="Times New Roman" w:hAnsi="Times New Roman" w:eastAsia="Times New Roman"/>
+          <w:rFonts w:ascii="Arial" w:hAnsi="Arial" w:eastAsia="Arial"/>
           <w:sz w:val="24"/>
         </w:rPr>
         <w:t>info@p-fg.com</w:t>
@@ -1416,8 +1702,11 @@
     <w:name w:val="Normal"/>
     <w:qFormat/>
     <w:rsid w:val="00FC693F"/>
+    <w:pPr>
+      <w:spacing w:after="0" w:before="0" w:line="240" w:lineRule="auto"/>
+    </w:pPr>
     <w:rPr>
-      <w:rFonts w:ascii="Times New Roman" w:hAnsi="Times New Roman" w:eastAsia="Times New Roman"/>
+      <w:rFonts w:ascii="Arial" w:hAnsi="Arial" w:eastAsia="Arial"/>
       <w:sz w:val="24"/>
     </w:rPr>
   </w:style>

</xml_diff>

<commit_message>
Replace example tasks with complete role-based execution scenarios.
Co-authored-by: Alim Abdurakhmanov <alim-abdurakhmanov@users.noreply.github.com>
</commit_message>
<xml_diff>
--- a/docs/FinBuild-opisanie-funkcionalnyh-harakteristik.docx
+++ b/docs/FinBuild-opisanie-funkcionalnyh-harakteristik.docx
@@ -3,85 +3,78 @@
 <w:document xmlns:wpc="http://schemas.microsoft.com/office/word/2010/wordprocessingCanvas" xmlns:mo="http://schemas.microsoft.com/office/mac/office/2008/main" xmlns:mc="http://schemas.openxmlformats.org/markup-compatibility/2006" xmlns:mv="urn:schemas-microsoft-com:mac:vml" xmlns:o="urn:schemas-microsoft-com:office:office" xmlns:r="http://schemas.openxmlformats.org/officeDocument/2006/relationships" xmlns:m="http://schemas.openxmlformats.org/officeDocument/2006/math" xmlns:v="urn:schemas-microsoft-com:vml" xmlns:wp14="http://schemas.microsoft.com/office/word/2010/wordprocessingDrawing" xmlns:wp="http://schemas.openxmlformats.org/drawingml/2006/wordprocessingDrawing" xmlns:w10="urn:schemas-microsoft-com:office:word" xmlns:w="http://schemas.openxmlformats.org/wordprocessingml/2006/main" xmlns:w14="http://schemas.microsoft.com/office/word/2010/wordml" xmlns:wpg="http://schemas.microsoft.com/office/word/2010/wordprocessingGroup" xmlns:wpi="http://schemas.microsoft.com/office/word/2010/wordprocessingInk" xmlns:wne="http://schemas.microsoft.com/office/word/2006/wordml" xmlns:wps="http://schemas.microsoft.com/office/word/2010/wordprocessingShape" mc:Ignorable="w14 wp14">
   <w:body>
     <w:p>
+      <w:pPr>
+        <w:spacing w:before="0" w:after="120"/>
+        <w:jc w:val="both"/>
+      </w:pPr>
       <w:r>
         <w:rPr>
-          <w:rFonts w:ascii="Arial" w:hAnsi="Arial" w:eastAsia="Arial"/>
+          <w:rFonts w:ascii="Times New Roman" w:hAnsi="Times New Roman" w:eastAsia="Times New Roman"/>
           <w:b w:val="0"/>
           <w:sz w:val="24"/>
         </w:rPr>
       </w:r>
     </w:p>
     <w:p>
+      <w:pPr>
+        <w:spacing w:before="0" w:after="120"/>
+        <w:jc w:val="both"/>
+      </w:pPr>
       <w:r>
         <w:rPr>
-          <w:rFonts w:ascii="Arial" w:hAnsi="Arial" w:eastAsia="Arial"/>
+          <w:rFonts w:ascii="Times New Roman" w:hAnsi="Times New Roman" w:eastAsia="Times New Roman"/>
           <w:b w:val="0"/>
           <w:sz w:val="24"/>
         </w:rPr>
       </w:r>
     </w:p>
     <w:p>
+      <w:pPr>
+        <w:spacing w:before="0" w:after="120"/>
+        <w:jc w:val="both"/>
+      </w:pPr>
       <w:r>
         <w:rPr>
-          <w:rFonts w:ascii="Arial" w:hAnsi="Arial" w:eastAsia="Arial"/>
+          <w:rFonts w:ascii="Times New Roman" w:hAnsi="Times New Roman" w:eastAsia="Times New Roman"/>
           <w:b w:val="0"/>
           <w:sz w:val="24"/>
         </w:rPr>
       </w:r>
     </w:p>
     <w:p>
+      <w:pPr>
+        <w:spacing w:before="0" w:after="120"/>
+        <w:jc w:val="both"/>
+      </w:pPr>
       <w:r>
         <w:rPr>
-          <w:rFonts w:ascii="Arial" w:hAnsi="Arial" w:eastAsia="Arial"/>
+          <w:rFonts w:ascii="Times New Roman" w:hAnsi="Times New Roman" w:eastAsia="Times New Roman"/>
           <w:b w:val="0"/>
           <w:sz w:val="24"/>
         </w:rPr>
       </w:r>
     </w:p>
     <w:p>
+      <w:pPr>
+        <w:spacing w:before="0" w:after="120"/>
+        <w:jc w:val="both"/>
+      </w:pPr>
       <w:r>
         <w:rPr>
-          <w:rFonts w:ascii="Arial" w:hAnsi="Arial" w:eastAsia="Arial"/>
+          <w:rFonts w:ascii="Times New Roman" w:hAnsi="Times New Roman" w:eastAsia="Times New Roman"/>
           <w:b w:val="0"/>
           <w:sz w:val="24"/>
         </w:rPr>
       </w:r>
     </w:p>
     <w:p>
+      <w:pPr>
+        <w:spacing w:before="0" w:after="0"/>
+        <w:jc w:val="center"/>
+      </w:pPr>
       <w:r>
         <w:rPr>
-          <w:rFonts w:ascii="Arial" w:hAnsi="Arial" w:eastAsia="Arial"/>
-          <w:b w:val="0"/>
-          <w:sz w:val="24"/>
-        </w:rPr>
-      </w:r>
-    </w:p>
-    <w:p>
-      <w:r>
-        <w:rPr>
-          <w:rFonts w:ascii="Arial" w:hAnsi="Arial" w:eastAsia="Arial"/>
-          <w:b w:val="0"/>
-          <w:sz w:val="24"/>
-        </w:rPr>
-      </w:r>
-    </w:p>
-    <w:p>
-      <w:r>
-        <w:rPr>
-          <w:rFonts w:ascii="Arial" w:hAnsi="Arial" w:eastAsia="Arial"/>
-          <w:b w:val="0"/>
-          <w:sz w:val="24"/>
-        </w:rPr>
-      </w:r>
-    </w:p>
-    <w:p>
-      <w:pPr>
-        <w:spacing w:after="0"/>
-        <w:jc w:val="center"/>
-      </w:pPr>
-      <w:r>
-        <w:rPr>
-          <w:rFonts w:ascii="Arial" w:hAnsi="Arial" w:eastAsia="Arial"/>
+          <w:rFonts w:ascii="Times New Roman" w:hAnsi="Times New Roman" w:eastAsia="Times New Roman"/>
           <w:b/>
           <w:sz w:val="28"/>
         </w:rPr>
@@ -90,12 +83,12 @@
     </w:p>
     <w:p>
       <w:pPr>
-        <w:spacing w:after="0"/>
+        <w:spacing w:before="0" w:after="0"/>
         <w:jc w:val="center"/>
       </w:pPr>
       <w:r>
         <w:rPr>
-          <w:rFonts w:ascii="Arial" w:hAnsi="Arial" w:eastAsia="Arial"/>
+          <w:rFonts w:ascii="Times New Roman" w:hAnsi="Times New Roman" w:eastAsia="Times New Roman"/>
           <w:b/>
           <w:sz w:val="28"/>
         </w:rPr>
@@ -103,121 +96,91 @@
       </w:r>
     </w:p>
     <w:p>
+      <w:pPr>
+        <w:spacing w:before="0" w:after="120"/>
+        <w:jc w:val="both"/>
+      </w:pPr>
       <w:r>
         <w:rPr>
-          <w:rFonts w:ascii="Arial" w:hAnsi="Arial" w:eastAsia="Arial"/>
+          <w:rFonts w:ascii="Times New Roman" w:hAnsi="Times New Roman" w:eastAsia="Times New Roman"/>
           <w:b w:val="0"/>
           <w:sz w:val="24"/>
         </w:rPr>
       </w:r>
     </w:p>
     <w:p>
+      <w:pPr>
+        <w:spacing w:before="0" w:after="120"/>
+        <w:jc w:val="both"/>
+      </w:pPr>
       <w:r>
         <w:rPr>
-          <w:rFonts w:ascii="Arial" w:hAnsi="Arial" w:eastAsia="Arial"/>
+          <w:rFonts w:ascii="Times New Roman" w:hAnsi="Times New Roman" w:eastAsia="Times New Roman"/>
           <w:b w:val="0"/>
           <w:sz w:val="24"/>
         </w:rPr>
       </w:r>
     </w:p>
     <w:p>
+      <w:pPr>
+        <w:spacing w:before="0" w:after="120"/>
+        <w:jc w:val="both"/>
+      </w:pPr>
       <w:r>
         <w:rPr>
-          <w:rFonts w:ascii="Arial" w:hAnsi="Arial" w:eastAsia="Arial"/>
+          <w:rFonts w:ascii="Times New Roman" w:hAnsi="Times New Roman" w:eastAsia="Times New Roman"/>
           <w:b w:val="0"/>
           <w:sz w:val="24"/>
         </w:rPr>
       </w:r>
     </w:p>
     <w:p>
+      <w:pPr>
+        <w:spacing w:before="0" w:after="120"/>
+        <w:jc w:val="both"/>
+      </w:pPr>
       <w:r>
         <w:rPr>
-          <w:rFonts w:ascii="Arial" w:hAnsi="Arial" w:eastAsia="Arial"/>
+          <w:rFonts w:ascii="Times New Roman" w:hAnsi="Times New Roman" w:eastAsia="Times New Roman"/>
           <w:b w:val="0"/>
           <w:sz w:val="24"/>
         </w:rPr>
       </w:r>
     </w:p>
     <w:p>
+      <w:pPr>
+        <w:spacing w:before="0" w:after="120"/>
+        <w:jc w:val="both"/>
+      </w:pPr>
       <w:r>
         <w:rPr>
-          <w:rFonts w:ascii="Arial" w:hAnsi="Arial" w:eastAsia="Arial"/>
+          <w:rFonts w:ascii="Times New Roman" w:hAnsi="Times New Roman" w:eastAsia="Times New Roman"/>
           <w:b w:val="0"/>
           <w:sz w:val="24"/>
         </w:rPr>
       </w:r>
     </w:p>
     <w:p>
+      <w:pPr>
+        <w:spacing w:before="0" w:after="120"/>
+        <w:jc w:val="both"/>
+      </w:pPr>
       <w:r>
         <w:rPr>
-          <w:rFonts w:ascii="Arial" w:hAnsi="Arial" w:eastAsia="Arial"/>
+          <w:rFonts w:ascii="Times New Roman" w:hAnsi="Times New Roman" w:eastAsia="Times New Roman"/>
           <w:b w:val="0"/>
           <w:sz w:val="24"/>
         </w:rPr>
       </w:r>
     </w:p>
     <w:p>
+      <w:pPr>
+        <w:spacing w:before="240" w:after="120"/>
+        <w:jc w:val="both"/>
+      </w:pPr>
       <w:r>
         <w:rPr>
-          <w:rFonts w:ascii="Arial" w:hAnsi="Arial" w:eastAsia="Arial"/>
-          <w:b w:val="0"/>
-          <w:sz w:val="24"/>
-        </w:rPr>
-      </w:r>
-    </w:p>
-    <w:p>
-      <w:r>
-        <w:rPr>
-          <w:rFonts w:ascii="Arial" w:hAnsi="Arial" w:eastAsia="Arial"/>
-          <w:b w:val="0"/>
-          <w:sz w:val="24"/>
-        </w:rPr>
-      </w:r>
-    </w:p>
-    <w:p>
-      <w:r>
-        <w:rPr>
-          <w:rFonts w:ascii="Arial" w:hAnsi="Arial" w:eastAsia="Arial"/>
-          <w:b w:val="0"/>
-          <w:sz w:val="24"/>
-        </w:rPr>
-      </w:r>
-    </w:p>
-    <w:p>
-      <w:r>
-        <w:rPr>
-          <w:rFonts w:ascii="Arial" w:hAnsi="Arial" w:eastAsia="Arial"/>
-          <w:b w:val="0"/>
-          <w:sz w:val="24"/>
-        </w:rPr>
-      </w:r>
-    </w:p>
-    <w:p>
-      <w:r>
-        <w:rPr>
-          <w:rFonts w:ascii="Arial" w:hAnsi="Arial" w:eastAsia="Arial"/>
-          <w:b w:val="0"/>
-          <w:sz w:val="24"/>
-        </w:rPr>
-      </w:r>
-    </w:p>
-    <w:p>
-      <w:r>
-        <w:rPr>
-          <w:rFonts w:ascii="Arial" w:hAnsi="Arial" w:eastAsia="Arial"/>
-          <w:b w:val="0"/>
-          <w:sz w:val="24"/>
-        </w:rPr>
-      </w:r>
-    </w:p>
-    <w:p>
-      <w:pPr>
-        <w:spacing w:before="240" w:after="120"/>
-        <w:jc w:val="both"/>
-      </w:pPr>
-      <w:r>
-        <w:rPr>
-          <w:rFonts w:ascii="Arial" w:hAnsi="Arial" w:eastAsia="Arial"/>
+          <w:rFonts w:ascii="Times New Roman" w:hAnsi="Times New Roman" w:eastAsia="Times New Roman"/>
           <w:b/>
           <w:sz w:val="28"/>
         </w:rPr>
@@ -226,12 +189,12 @@
     </w:p>
     <w:p>
       <w:pPr>
-        <w:spacing w:after="40"/>
+        <w:spacing w:before="0" w:after="40"/>
         <w:jc w:val="both"/>
       </w:pPr>
       <w:r>
         <w:rPr>
-          <w:rFonts w:ascii="Arial" w:hAnsi="Arial" w:eastAsia="Arial"/>
+          <w:rFonts w:ascii="Times New Roman" w:hAnsi="Times New Roman" w:eastAsia="Times New Roman"/>
           <w:b w:val="0"/>
           <w:sz w:val="24"/>
         </w:rPr>
@@ -240,12 +203,12 @@
     </w:p>
     <w:p>
       <w:pPr>
-        <w:spacing w:after="40"/>
+        <w:spacing w:before="0" w:after="40"/>
         <w:jc w:val="both"/>
       </w:pPr>
       <w:r>
         <w:rPr>
-          <w:rFonts w:ascii="Arial" w:hAnsi="Arial" w:eastAsia="Arial"/>
+          <w:rFonts w:ascii="Times New Roman" w:hAnsi="Times New Roman" w:eastAsia="Times New Roman"/>
           <w:b w:val="0"/>
           <w:sz w:val="24"/>
         </w:rPr>
@@ -254,12 +217,12 @@
     </w:p>
     <w:p>
       <w:pPr>
-        <w:spacing w:after="40"/>
+        <w:spacing w:before="0" w:after="40"/>
         <w:jc w:val="both"/>
       </w:pPr>
       <w:r>
         <w:rPr>
-          <w:rFonts w:ascii="Arial" w:hAnsi="Arial" w:eastAsia="Arial"/>
+          <w:rFonts w:ascii="Times New Roman" w:hAnsi="Times New Roman" w:eastAsia="Times New Roman"/>
           <w:b w:val="0"/>
           <w:sz w:val="24"/>
         </w:rPr>
@@ -268,12 +231,12 @@
     </w:p>
     <w:p>
       <w:pPr>
-        <w:spacing w:after="40"/>
+        <w:spacing w:before="0" w:after="40"/>
         <w:jc w:val="both"/>
       </w:pPr>
       <w:r>
         <w:rPr>
-          <w:rFonts w:ascii="Arial" w:hAnsi="Arial" w:eastAsia="Arial"/>
+          <w:rFonts w:ascii="Times New Roman" w:hAnsi="Times New Roman" w:eastAsia="Times New Roman"/>
           <w:b w:val="0"/>
           <w:sz w:val="24"/>
         </w:rPr>
@@ -282,26 +245,26 @@
     </w:p>
     <w:p>
       <w:pPr>
-        <w:spacing w:after="40"/>
+        <w:spacing w:before="0" w:after="40"/>
         <w:jc w:val="both"/>
       </w:pPr>
       <w:r>
         <w:rPr>
-          <w:rFonts w:ascii="Arial" w:hAnsi="Arial" w:eastAsia="Arial"/>
+          <w:rFonts w:ascii="Times New Roman" w:hAnsi="Times New Roman" w:eastAsia="Times New Roman"/>
           <w:b w:val="0"/>
           <w:sz w:val="24"/>
         </w:rPr>
-        <w:t>5. Выполнение программы (примеры типовых задач)</w:t>
+        <w:t>5. Выполнение программы</w:t>
       </w:r>
     </w:p>
     <w:p>
       <w:pPr>
-        <w:spacing w:after="120"/>
+        <w:spacing w:before="0" w:after="40"/>
         <w:jc w:val="both"/>
       </w:pPr>
       <w:r>
         <w:rPr>
-          <w:rFonts w:ascii="Arial" w:hAnsi="Arial" w:eastAsia="Arial"/>
+          <w:rFonts w:ascii="Times New Roman" w:hAnsi="Times New Roman" w:eastAsia="Times New Roman"/>
           <w:b w:val="0"/>
           <w:sz w:val="24"/>
         </w:rPr>
@@ -315,7 +278,7 @@
       </w:pPr>
       <w:r>
         <w:rPr>
-          <w:rFonts w:ascii="Arial" w:hAnsi="Arial" w:eastAsia="Arial"/>
+          <w:rFonts w:ascii="Times New Roman" w:hAnsi="Times New Roman" w:eastAsia="Times New Roman"/>
           <w:b/>
           <w:sz w:val="28"/>
         </w:rPr>
@@ -324,13 +287,13 @@
     </w:p>
     <w:p>
       <w:pPr>
-        <w:spacing w:after="120"/>
+        <w:spacing w:before="0" w:after="120"/>
         <w:ind w:firstLine="709"/>
         <w:jc w:val="both"/>
       </w:pPr>
       <w:r>
         <w:rPr>
-          <w:rFonts w:ascii="Arial" w:hAnsi="Arial" w:eastAsia="Arial"/>
+          <w:rFonts w:ascii="Times New Roman" w:hAnsi="Times New Roman" w:eastAsia="Times New Roman"/>
           <w:b w:val="0"/>
           <w:sz w:val="24"/>
         </w:rPr>
@@ -344,7 +307,7 @@
       </w:pPr>
       <w:r>
         <w:rPr>
-          <w:rFonts w:ascii="Arial" w:hAnsi="Arial" w:eastAsia="Arial"/>
+          <w:rFonts w:ascii="Times New Roman" w:hAnsi="Times New Roman" w:eastAsia="Times New Roman"/>
           <w:b/>
           <w:sz w:val="28"/>
         </w:rPr>
@@ -353,32 +316,32 @@
     </w:p>
     <w:p>
       <w:pPr>
-        <w:spacing w:after="120"/>
+        <w:spacing w:before="0" w:after="120"/>
         <w:ind w:firstLine="709"/>
         <w:jc w:val="both"/>
       </w:pPr>
       <w:r>
         <w:rPr>
-          <w:rFonts w:ascii="Arial" w:hAnsi="Arial" w:eastAsia="Arial"/>
+          <w:rFonts w:ascii="Times New Roman" w:hAnsi="Times New Roman" w:eastAsia="Times New Roman"/>
           <w:b w:val="0"/>
           <w:sz w:val="24"/>
         </w:rPr>
-        <w:t>ПО «FinBuild» – клиент-серверное веб-приложение (программа для ЭВМ), предназначенное для организации полного цикла работы с заявками на банковские гарантии и иные финансовые продукты для бизнеса: приём и обработка заявок, подбор банковских программ, документооборот, коммуникация участников процесса, предварительная и внутрибанковская оценка принципала, взаимодействие с банками через отдельные личные кабинеты, контроль статусов и администрирование пользователей и прав доступа.</w:t>
+        <w:t>ПО «FinBuild» – клиент-серверное веб-приложение (программа для ЭВМ), предназначенное для организации полного цикла работы с заявками на банковские гарантии и иные финансовые продукты для бизнеса: приём и обработка заявок, подбор банковских программ, документооборот, коммуникация участников процесса, оценка принципала, взаимодействие с банками через отдельные личные кабинеты, контроль статусов и администрирование пользователей и прав доступа.</w:t>
       </w:r>
     </w:p>
     <w:p>
       <w:pPr>
-        <w:spacing w:after="120"/>
+        <w:spacing w:before="0" w:after="120"/>
         <w:ind w:firstLine="709"/>
         <w:jc w:val="both"/>
       </w:pPr>
       <w:r>
         <w:rPr>
-          <w:rFonts w:ascii="Arial" w:hAnsi="Arial" w:eastAsia="Arial"/>
+          <w:rFonts w:ascii="Times New Roman" w:hAnsi="Times New Roman" w:eastAsia="Times New Roman"/>
           <w:b w:val="0"/>
           <w:sz w:val="24"/>
         </w:rPr>
-        <w:t>ПО обеспечивает совместную работу клиентов, партнёров, сотрудников платформы (менеджеров, руководителей, аналитиков), заказчиков (бенефициаров) и представителей банков в едином цифровом контуре. Архитектура ПО допускает подключение дополнительных банковских порталов, расширение продуктовой линейки, развитие методик оценки и интеграций с внешними источниками данных без изменения базовой ролевой и процессной модели.</w:t>
+        <w:t>ПО обеспечивает совместную работу клиентов, партнёров, сотрудников платформы, заказчиков и представителей банков в едином цифровом контуре. Архитектура ПО допускает подключение дополнительных банковских порталов, расширение продуктовой линейки, развитие методик оценки и интеграций с внешними источниками данных без изменения базовой ролевой и процессной модели.</w:t>
       </w:r>
     </w:p>
     <w:p>
@@ -388,7 +351,7 @@
       </w:pPr>
       <w:r>
         <w:rPr>
-          <w:rFonts w:ascii="Arial" w:hAnsi="Arial" w:eastAsia="Arial"/>
+          <w:rFonts w:ascii="Times New Roman" w:hAnsi="Times New Roman" w:eastAsia="Times New Roman"/>
           <w:b/>
           <w:sz w:val="28"/>
         </w:rPr>
@@ -397,13 +360,13 @@
     </w:p>
     <w:p>
       <w:pPr>
-        <w:spacing w:after="80"/>
+        <w:spacing w:before="0" w:after="80"/>
         <w:ind w:firstLine="709"/>
         <w:jc w:val="both"/>
       </w:pPr>
       <w:r>
         <w:rPr>
-          <w:rFonts w:ascii="Arial" w:hAnsi="Arial" w:eastAsia="Arial"/>
+          <w:rFonts w:ascii="Times New Roman" w:hAnsi="Times New Roman" w:eastAsia="Times New Roman"/>
           <w:b w:val="0"/>
           <w:sz w:val="24"/>
         </w:rPr>
@@ -414,12 +377,12 @@
       <w:pPr>
         <w:pStyle w:val="ListBullet"/>
         <w:spacing w:after="40"/>
-        <w:ind w:firstLine="0" w:left="709"/>
+        <w:ind w:left="709"/>
         <w:jc w:val="both"/>
       </w:pPr>
       <w:r>
         <w:rPr>
-          <w:rFonts w:ascii="Arial" w:hAnsi="Arial" w:eastAsia="Arial"/>
+          <w:rFonts w:ascii="Times New Roman" w:hAnsi="Times New Roman" w:eastAsia="Times New Roman"/>
           <w:b w:val="0"/>
           <w:sz w:val="24"/>
         </w:rPr>
@@ -430,12 +393,12 @@
       <w:pPr>
         <w:pStyle w:val="ListBullet"/>
         <w:spacing w:after="40"/>
-        <w:ind w:firstLine="0" w:left="709"/>
+        <w:ind w:left="709"/>
         <w:jc w:val="both"/>
       </w:pPr>
       <w:r>
         <w:rPr>
-          <w:rFonts w:ascii="Arial" w:hAnsi="Arial" w:eastAsia="Arial"/>
+          <w:rFonts w:ascii="Times New Roman" w:hAnsi="Times New Roman" w:eastAsia="Times New Roman"/>
           <w:b w:val="0"/>
           <w:sz w:val="24"/>
         </w:rPr>
@@ -446,92 +409,92 @@
       <w:pPr>
         <w:pStyle w:val="ListBullet"/>
         <w:spacing w:after="40"/>
-        <w:ind w:firstLine="0" w:left="709"/>
+        <w:ind w:left="709"/>
         <w:jc w:val="both"/>
       </w:pPr>
       <w:r>
         <w:rPr>
-          <w:rFonts w:ascii="Arial" w:hAnsi="Arial" w:eastAsia="Arial"/>
+          <w:rFonts w:ascii="Times New Roman" w:hAnsi="Times New Roman" w:eastAsia="Times New Roman"/>
           <w:b w:val="0"/>
           <w:sz w:val="24"/>
         </w:rPr>
-        <w:t>автоматическое и ручное заполнение сведений о компании (в том числе по ИНН с использованием внешних источников данных);</w:t>
+        <w:t>заполнение сведений о компании и параметрах заявки;</w:t>
       </w:r>
     </w:p>
     <w:p>
       <w:pPr>
         <w:pStyle w:val="ListBullet"/>
         <w:spacing w:after="40"/>
-        <w:ind w:firstLine="0" w:left="709"/>
+        <w:ind w:left="709"/>
         <w:jc w:val="both"/>
       </w:pPr>
       <w:r>
         <w:rPr>
-          <w:rFonts w:ascii="Arial" w:hAnsi="Arial" w:eastAsia="Arial"/>
+          <w:rFonts w:ascii="Times New Roman" w:hAnsi="Times New Roman" w:eastAsia="Times New Roman"/>
           <w:b w:val="0"/>
           <w:sz w:val="24"/>
         </w:rPr>
-        <w:t>подбор банковских продуктов по параметрам заявки и предварительный расчёт лимитов;</w:t>
+        <w:t>подбор банковских продуктов и предварительный расчёт лимитов;</w:t>
       </w:r>
     </w:p>
     <w:p>
       <w:pPr>
         <w:pStyle w:val="ListBullet"/>
         <w:spacing w:after="40"/>
-        <w:ind w:firstLine="0" w:left="709"/>
+        <w:ind w:left="709"/>
         <w:jc w:val="both"/>
       </w:pPr>
       <w:r>
         <w:rPr>
-          <w:rFonts w:ascii="Arial" w:hAnsi="Arial" w:eastAsia="Arial"/>
+          <w:rFonts w:ascii="Times New Roman" w:hAnsi="Times New Roman" w:eastAsia="Times New Roman"/>
           <w:b w:val="0"/>
           <w:sz w:val="24"/>
         </w:rPr>
-        <w:t>ведение карточки заявки: информация, продукты, документы, аналитика, структура принципала, дорожная карта, чаты;</w:t>
+        <w:t>ведение карточки заявки (информация, продукты, документы, аналитика, структура, дорожная карта, чаты);</w:t>
       </w:r>
     </w:p>
     <w:p>
       <w:pPr>
         <w:pStyle w:val="ListBullet"/>
         <w:spacing w:after="40"/>
-        <w:ind w:firstLine="0" w:left="709"/>
+        <w:ind w:left="709"/>
         <w:jc w:val="both"/>
       </w:pPr>
       <w:r>
         <w:rPr>
-          <w:rFonts w:ascii="Arial" w:hAnsi="Arial" w:eastAsia="Arial"/>
+          <w:rFonts w:ascii="Times New Roman" w:hAnsi="Times New Roman" w:eastAsia="Times New Roman"/>
           <w:b w:val="0"/>
           <w:sz w:val="24"/>
         </w:rPr>
-        <w:t>загрузку, хранение, просмотр и выгрузку документов (включая пакетную выгрузку);</w:t>
+        <w:t>загрузку, хранение, просмотр и выгрузку документов;</w:t>
       </w:r>
     </w:p>
     <w:p>
       <w:pPr>
         <w:pStyle w:val="ListBullet"/>
         <w:spacing w:after="40"/>
-        <w:ind w:firstLine="0" w:left="709"/>
+        <w:ind w:left="709"/>
         <w:jc w:val="both"/>
       </w:pPr>
       <w:r>
         <w:rPr>
-          <w:rFonts w:ascii="Arial" w:hAnsi="Arial" w:eastAsia="Arial"/>
+          <w:rFonts w:ascii="Times New Roman" w:hAnsi="Times New Roman" w:eastAsia="Times New Roman"/>
           <w:b w:val="0"/>
           <w:sz w:val="24"/>
         </w:rPr>
-        <w:t>формирование и обработку запросов документов между участниками процесса;</w:t>
+        <w:t>формирование и обработку запросов документов;</w:t>
       </w:r>
     </w:p>
     <w:p>
       <w:pPr>
         <w:pStyle w:val="ListBullet"/>
         <w:spacing w:after="40"/>
-        <w:ind w:firstLine="0" w:left="709"/>
+        <w:ind w:left="709"/>
         <w:jc w:val="both"/>
       </w:pPr>
       <w:r>
         <w:rPr>
-          <w:rFonts w:ascii="Arial" w:hAnsi="Arial" w:eastAsia="Arial"/>
+          <w:rFonts w:ascii="Times New Roman" w:hAnsi="Times New Roman" w:eastAsia="Times New Roman"/>
           <w:b w:val="0"/>
           <w:sz w:val="24"/>
         </w:rPr>
@@ -542,28 +505,28 @@
       <w:pPr>
         <w:pStyle w:val="ListBullet"/>
         <w:spacing w:after="40"/>
-        <w:ind w:firstLine="0" w:left="709"/>
+        <w:ind w:left="709"/>
         <w:jc w:val="both"/>
       </w:pPr>
       <w:r>
         <w:rPr>
-          <w:rFonts w:ascii="Arial" w:hAnsi="Arial" w:eastAsia="Arial"/>
+          <w:rFonts w:ascii="Times New Roman" w:hAnsi="Times New Roman" w:eastAsia="Times New Roman"/>
           <w:b w:val="0"/>
           <w:sz w:val="24"/>
         </w:rPr>
-        <w:t>коммуникацию в чатах по заявке и по продукту, а также в чате с банком;</w:t>
+        <w:t>коммуникацию в чатах по заявке, по продукту и с банком;</w:t>
       </w:r>
     </w:p>
     <w:p>
       <w:pPr>
         <w:pStyle w:val="ListBullet"/>
         <w:spacing w:after="40"/>
-        <w:ind w:firstLine="0" w:left="709"/>
+        <w:ind w:left="709"/>
         <w:jc w:val="both"/>
       </w:pPr>
       <w:r>
         <w:rPr>
-          <w:rFonts w:ascii="Arial" w:hAnsi="Arial" w:eastAsia="Arial"/>
+          <w:rFonts w:ascii="Times New Roman" w:hAnsi="Times New Roman" w:eastAsia="Times New Roman"/>
           <w:b w:val="0"/>
           <w:sz w:val="24"/>
         </w:rPr>
@@ -574,60 +537,60 @@
       <w:pPr>
         <w:pStyle w:val="ListBullet"/>
         <w:spacing w:after="40"/>
-        <w:ind w:firstLine="0" w:left="709"/>
+        <w:ind w:left="709"/>
         <w:jc w:val="both"/>
       </w:pPr>
       <w:r>
         <w:rPr>
-          <w:rFonts w:ascii="Arial" w:hAnsi="Arial" w:eastAsia="Arial"/>
+          <w:rFonts w:ascii="Times New Roman" w:hAnsi="Times New Roman" w:eastAsia="Times New Roman"/>
           <w:b w:val="0"/>
           <w:sz w:val="24"/>
         </w:rPr>
-        <w:t>работу представителей банка в отдельном личном кабинете банка (просмотр заявок, документы, статусы, чат, структура, аналитика);</w:t>
+        <w:t>работу представителей банка в отдельном личном кабинете банка;</w:t>
       </w:r>
     </w:p>
     <w:p>
       <w:pPr>
         <w:pStyle w:val="ListBullet"/>
         <w:spacing w:after="40"/>
-        <w:ind w:firstLine="0" w:left="709"/>
+        <w:ind w:left="709"/>
         <w:jc w:val="both"/>
       </w:pPr>
       <w:r>
         <w:rPr>
-          <w:rFonts w:ascii="Arial" w:hAnsi="Arial" w:eastAsia="Arial"/>
+          <w:rFonts w:ascii="Times New Roman" w:hAnsi="Times New Roman" w:eastAsia="Times New Roman"/>
           <w:b w:val="0"/>
           <w:sz w:val="24"/>
         </w:rPr>
-        <w:t>проведение внутрибанковской оценки кредитоспособности (банковская методика): стоп-факторы, финансовые и бизнес-показатели, профсуждение, версионность оценок;</w:t>
+        <w:t>проведение банковской оценки кредитоспособности (банковская методика);</w:t>
       </w:r>
     </w:p>
     <w:p>
       <w:pPr>
         <w:pStyle w:val="ListBullet"/>
         <w:spacing w:after="40"/>
-        <w:ind w:firstLine="0" w:left="709"/>
+        <w:ind w:left="709"/>
         <w:jc w:val="both"/>
       </w:pPr>
       <w:r>
         <w:rPr>
-          <w:rFonts w:ascii="Arial" w:hAnsi="Arial" w:eastAsia="Arial"/>
+          <w:rFonts w:ascii="Times New Roman" w:hAnsi="Times New Roman" w:eastAsia="Times New Roman"/>
           <w:b w:val="0"/>
           <w:sz w:val="24"/>
         </w:rPr>
-        <w:t>получение и отображение аналитики по компании (рейтинг/скоринг, ключевые факторы, открытые данные);</w:t>
+        <w:t>получение и отображение аналитики по компании;</w:t>
       </w:r>
     </w:p>
     <w:p>
       <w:pPr>
         <w:pStyle w:val="ListBullet"/>
         <w:spacing w:after="40"/>
-        <w:ind w:firstLine="0" w:left="709"/>
+        <w:ind w:left="709"/>
         <w:jc w:val="both"/>
       </w:pPr>
       <w:r>
         <w:rPr>
-          <w:rFonts w:ascii="Arial" w:hAnsi="Arial" w:eastAsia="Arial"/>
+          <w:rFonts w:ascii="Times New Roman" w:hAnsi="Times New Roman" w:eastAsia="Times New Roman"/>
           <w:b w:val="0"/>
           <w:sz w:val="24"/>
         </w:rPr>
@@ -638,28 +601,28 @@
       <w:pPr>
         <w:pStyle w:val="ListBullet"/>
         <w:spacing w:after="40"/>
-        <w:ind w:firstLine="0" w:left="709"/>
+        <w:ind w:left="709"/>
         <w:jc w:val="both"/>
       </w:pPr>
       <w:r>
         <w:rPr>
-          <w:rFonts w:ascii="Arial" w:hAnsi="Arial" w:eastAsia="Arial"/>
+          <w:rFonts w:ascii="Times New Roman" w:hAnsi="Times New Roman" w:eastAsia="Times New Roman"/>
           <w:b w:val="0"/>
           <w:sz w:val="24"/>
         </w:rPr>
-        <w:t>управление пользователями и ролями, настройку матрицы прав доступа;</w:t>
+        <w:t>управление пользователями и ролями, настройку прав доступа;</w:t>
       </w:r>
     </w:p>
     <w:p>
       <w:pPr>
         <w:pStyle w:val="ListBullet"/>
         <w:spacing w:after="40"/>
-        <w:ind w:firstLine="0" w:left="709"/>
+        <w:ind w:left="709"/>
         <w:jc w:val="both"/>
       </w:pPr>
       <w:r>
         <w:rPr>
-          <w:rFonts w:ascii="Arial" w:hAnsi="Arial" w:eastAsia="Arial"/>
+          <w:rFonts w:ascii="Times New Roman" w:hAnsi="Times New Roman" w:eastAsia="Times New Roman"/>
           <w:b w:val="0"/>
           <w:sz w:val="24"/>
         </w:rPr>
@@ -670,32 +633,32 @@
       <w:pPr>
         <w:pStyle w:val="ListBullet"/>
         <w:spacing w:after="40"/>
-        <w:ind w:firstLine="0" w:left="709"/>
+        <w:ind w:left="709"/>
         <w:jc w:val="both"/>
       </w:pPr>
       <w:r>
         <w:rPr>
-          <w:rFonts w:ascii="Arial" w:hAnsi="Arial" w:eastAsia="Arial"/>
+          <w:rFonts w:ascii="Times New Roman" w:hAnsi="Times New Roman" w:eastAsia="Times New Roman"/>
           <w:b w:val="0"/>
           <w:sz w:val="24"/>
         </w:rPr>
-        <w:t>обращение в службу поддержки и ведение переписки по обращениям;</w:t>
+        <w:t>обращение в службу поддержки;</w:t>
       </w:r>
     </w:p>
     <w:p>
       <w:pPr>
         <w:pStyle w:val="ListBullet"/>
         <w:spacing w:after="40"/>
-        <w:ind w:firstLine="0" w:left="709"/>
+        <w:ind w:left="709"/>
         <w:jc w:val="both"/>
       </w:pPr>
       <w:r>
         <w:rPr>
-          <w:rFonts w:ascii="Arial" w:hAnsi="Arial" w:eastAsia="Arial"/>
+          <w:rFonts w:ascii="Times New Roman" w:hAnsi="Times New Roman" w:eastAsia="Times New Roman"/>
           <w:b w:val="0"/>
           <w:sz w:val="24"/>
         </w:rPr>
-        <w:t>отправку сервисных уведомлений участникам процесса (в том числе по электронной почте).</w:t>
+        <w:t>отправку сервисных уведомлений участникам процесса.</w:t>
       </w:r>
     </w:p>
     <w:p>
@@ -705,7 +668,7 @@
       </w:pPr>
       <w:r>
         <w:rPr>
-          <w:rFonts w:ascii="Arial" w:hAnsi="Arial" w:eastAsia="Arial"/>
+          <w:rFonts w:ascii="Times New Roman" w:hAnsi="Times New Roman" w:eastAsia="Times New Roman"/>
           <w:b/>
           <w:sz w:val="28"/>
         </w:rPr>
@@ -714,122 +677,122 @@
     </w:p>
     <w:p>
       <w:pPr>
-        <w:spacing w:after="80"/>
+        <w:spacing w:before="0" w:after="80"/>
         <w:ind w:firstLine="709"/>
         <w:jc w:val="both"/>
       </w:pPr>
       <w:r>
         <w:rPr>
-          <w:rFonts w:ascii="Arial" w:hAnsi="Arial" w:eastAsia="Arial"/>
+          <w:rFonts w:ascii="Times New Roman" w:hAnsi="Times New Roman" w:eastAsia="Times New Roman"/>
           <w:b w:val="0"/>
           <w:sz w:val="24"/>
         </w:rPr>
-        <w:t>В ПО «FinBuild» предусмотрена многоролевая модель доступа. Конкретный набор доступных разделов и действий определяется ролью пользователя и настраиваемой матрицей прав.</w:t>
+        <w:t>В ПО «FinBuild» предусмотрена многоролевая модель доступа. Набор доступных разделов и действий определяется ролью пользователя и настройками прав.</w:t>
       </w:r>
     </w:p>
     <w:p>
       <w:pPr>
-        <w:spacing w:after="80"/>
+        <w:spacing w:before="0" w:after="80"/>
         <w:ind w:firstLine="709"/>
         <w:jc w:val="both"/>
       </w:pPr>
       <w:r>
         <w:rPr>
-          <w:rFonts w:ascii="Arial" w:hAnsi="Arial" w:eastAsia="Arial"/>
+          <w:rFonts w:ascii="Times New Roman" w:hAnsi="Times New Roman" w:eastAsia="Times New Roman"/>
           <w:b w:val="0"/>
           <w:sz w:val="24"/>
         </w:rPr>
-        <w:t>Клиент — создаёт и ведёт собственные заявки, загружает документы, использует инструменты подбора продуктов и аналитики, ведёт переписку в рамках своих заявок.</w:t>
+        <w:t>Клиент — создаёт и ведёт собственные заявки, загружает документы, использует инструменты подбора и аналитики, ведёт переписку в рамках своих заявок.</w:t>
       </w:r>
     </w:p>
     <w:p>
       <w:pPr>
-        <w:spacing w:after="80"/>
+        <w:spacing w:before="0" w:after="80"/>
         <w:ind w:firstLine="709"/>
         <w:jc w:val="both"/>
       </w:pPr>
       <w:r>
         <w:rPr>
-          <w:rFonts w:ascii="Arial" w:hAnsi="Arial" w:eastAsia="Arial"/>
+          <w:rFonts w:ascii="Times New Roman" w:hAnsi="Times New Roman" w:eastAsia="Times New Roman"/>
           <w:b w:val="0"/>
           <w:sz w:val="24"/>
         </w:rPr>
-        <w:t>Партнёр — работает с заявками в интересах клиентов (принципалов), использует тот же контур заявок и инструментов; при наличии соответствующего признака может получать расширенный доступ к анализу заявок.</w:t>
+        <w:t>Партнёр — работает с заявками в интересах принципалов, использует контур заявок и инструментов платформы.</w:t>
       </w:r>
     </w:p>
     <w:p>
       <w:pPr>
-        <w:spacing w:after="80"/>
+        <w:spacing w:before="0" w:after="80"/>
         <w:ind w:firstLine="709"/>
         <w:jc w:val="both"/>
       </w:pPr>
       <w:r>
         <w:rPr>
-          <w:rFonts w:ascii="Arial" w:hAnsi="Arial" w:eastAsia="Arial"/>
+          <w:rFonts w:ascii="Times New Roman" w:hAnsi="Times New Roman" w:eastAsia="Times New Roman"/>
           <w:b w:val="0"/>
           <w:sz w:val="24"/>
         </w:rPr>
-        <w:t>Заказчик (бенефициар) — инициирует заявку на банковскую гарантию (intake), после рассмотрения сотрудником платформы взаимодействует в отдельном чате и в рамках согласованных параметров заявки.</w:t>
+        <w:t>Заказчик — инициирует заявку на банковскую гарантию; после рассмотрения сотрудником платформы взаимодействует в рамках согласованных параметров заявки.</w:t>
       </w:r>
     </w:p>
     <w:p>
       <w:pPr>
-        <w:spacing w:after="80"/>
+        <w:spacing w:before="0" w:after="80"/>
         <w:ind w:firstLine="709"/>
         <w:jc w:val="both"/>
       </w:pPr>
       <w:r>
         <w:rPr>
-          <w:rFonts w:ascii="Arial" w:hAnsi="Arial" w:eastAsia="Arial"/>
+          <w:rFonts w:ascii="Times New Roman" w:hAnsi="Times New Roman" w:eastAsia="Times New Roman"/>
           <w:b w:val="0"/>
           <w:sz w:val="24"/>
         </w:rPr>
-        <w:t>Менеджер / менеджер по заявкам — обрабатывает заявки, назначает/ведёт продукты, работает с документами и чатами, отправляет пакеты в банки, сопровождает статусы.</w:t>
+        <w:t>Менеджер / менеджер по заявкам — обрабатывает заявки, ведёт продукты и документы, отправляет пакеты в банки, сопровождает статусы.</w:t>
       </w:r>
     </w:p>
     <w:p>
       <w:pPr>
-        <w:spacing w:after="80"/>
+        <w:spacing w:before="0" w:after="80"/>
         <w:ind w:firstLine="709"/>
         <w:jc w:val="both"/>
       </w:pPr>
       <w:r>
         <w:rPr>
-          <w:rFonts w:ascii="Arial" w:hAnsi="Arial" w:eastAsia="Arial"/>
+          <w:rFonts w:ascii="Times New Roman" w:hAnsi="Times New Roman" w:eastAsia="Times New Roman"/>
           <w:b w:val="0"/>
           <w:sz w:val="24"/>
         </w:rPr>
-        <w:t>Руководитель — обладает расширенными полномочиями по заявкам, методике, администрированию пользователей, продуктов, статистики и прав доступа.</w:t>
+        <w:t>Руководитель — обладает расширенными полномочиями по заявкам, оценке, администрированию пользователей, продуктов, статистики и прав доступа.</w:t>
       </w:r>
     </w:p>
     <w:p>
       <w:pPr>
-        <w:spacing w:after="80"/>
+        <w:spacing w:before="0" w:after="80"/>
         <w:ind w:firstLine="709"/>
         <w:jc w:val="both"/>
       </w:pPr>
       <w:r>
         <w:rPr>
-          <w:rFonts w:ascii="Arial" w:hAnsi="Arial" w:eastAsia="Arial"/>
+          <w:rFonts w:ascii="Times New Roman" w:hAnsi="Times New Roman" w:eastAsia="Times New Roman"/>
           <w:b w:val="0"/>
           <w:sz w:val="24"/>
         </w:rPr>
-        <w:t>Аналитик — работает с заявками в части анализа и структуры принципала, документов и связанных аналитических материалов в пределах назначенных прав.</w:t>
+        <w:t>Аналитик — работает с заявками в части анализа, структуры принципала и документов в пределах назначенных прав.</w:t>
       </w:r>
     </w:p>
     <w:p>
       <w:pPr>
-        <w:spacing w:after="80"/>
+        <w:spacing w:before="0" w:after="80"/>
         <w:ind w:firstLine="709"/>
         <w:jc w:val="both"/>
       </w:pPr>
       <w:r>
         <w:rPr>
-          <w:rFonts w:ascii="Arial" w:hAnsi="Arial" w:eastAsia="Arial"/>
+          <w:rFonts w:ascii="Times New Roman" w:hAnsi="Times New Roman" w:eastAsia="Times New Roman"/>
           <w:b w:val="0"/>
           <w:sz w:val="24"/>
         </w:rPr>
-        <w:t>Банк — работает в личном кабинете банка со своими заявками (кейсами): просматривает пакет, меняет статусы, общается с менеджером, использует аналитику, структуру и банковскую методику (в соответствии с настройками портала банка).</w:t>
+        <w:t>Банк — работает в личном кабинете банка со своими заявками: просматривает пакет, меняет статусы, общается с менеджером, использует доступные вкладки кабинета.</w:t>
       </w:r>
     </w:p>
     <w:p>
@@ -839,7 +802,7 @@
       </w:pPr>
       <w:r>
         <w:rPr>
-          <w:rFonts w:ascii="Arial" w:hAnsi="Arial" w:eastAsia="Arial"/>
+          <w:rFonts w:ascii="Times New Roman" w:hAnsi="Times New Roman" w:eastAsia="Times New Roman"/>
           <w:b/>
           <w:sz w:val="28"/>
         </w:rPr>
@@ -848,73 +811,87 @@
     </w:p>
     <w:p>
       <w:pPr>
-        <w:spacing w:after="120"/>
+        <w:spacing w:before="0" w:after="160"/>
         <w:ind w:firstLine="709"/>
         <w:jc w:val="both"/>
       </w:pPr>
       <w:r>
         <w:rPr>
-          <w:rFonts w:ascii="Arial" w:hAnsi="Arial" w:eastAsia="Arial"/>
+          <w:rFonts w:ascii="Times New Roman" w:hAnsi="Times New Roman" w:eastAsia="Times New Roman"/>
           <w:b w:val="0"/>
           <w:sz w:val="24"/>
         </w:rPr>
-        <w:t>Ниже приведены типовые сценарии выполнения программы. Фактический состав экранов и полей может уточняться в рамках развития ПО при сохранении описанной логики процессов.</w:t>
+        <w:t>В настоящем разделе описаны сценарии работы пользователей в ПО. Состав экранов и наименований элементов интерфейса может уточняться по мере развития ПО при сохранении описанной логики.</w:t>
       </w:r>
     </w:p>
     <w:p>
       <w:pPr>
+        <w:spacing w:before="240" w:after="120"/>
+        <w:jc w:val="both"/>
+      </w:pPr>
+      <w:r>
+        <w:rPr>
+          <w:rFonts w:ascii="Times New Roman" w:hAnsi="Times New Roman" w:eastAsia="Times New Roman"/>
+          <w:b/>
+          <w:sz w:val="26"/>
+        </w:rPr>
+        <w:t>Общие сценарии</w:t>
+      </w:r>
+    </w:p>
+    <w:p>
+      <w:pPr>
         <w:spacing w:before="200" w:after="80"/>
         <w:jc w:val="both"/>
       </w:pPr>
       <w:r>
         <w:rPr>
-          <w:rFonts w:ascii="Arial" w:hAnsi="Arial" w:eastAsia="Arial"/>
+          <w:rFonts w:ascii="Times New Roman" w:hAnsi="Times New Roman" w:eastAsia="Times New Roman"/>
           <w:b/>
           <w:sz w:val="24"/>
         </w:rPr>
-        <w:t>Пример 1. Задача: «Вход в личный кабинет пользователя»</w:t>
+        <w:t>1. Вход в личный кабинет</w:t>
       </w:r>
     </w:p>
     <w:p>
       <w:pPr>
-        <w:spacing w:after="60"/>
+        <w:spacing w:before="0" w:after="60"/>
         <w:jc w:val="both"/>
       </w:pPr>
       <w:r>
         <w:rPr>
-          <w:rFonts w:ascii="Arial" w:hAnsi="Arial" w:eastAsia="Arial"/>
+          <w:rFonts w:ascii="Times New Roman" w:hAnsi="Times New Roman" w:eastAsia="Times New Roman"/>
           <w:b w:val="0"/>
           <w:sz w:val="24"/>
         </w:rPr>
-        <w:t>Пользователь открывает страницу входа в ПО и указывает адрес электронной почты (логин) и пароль.</w:t>
+        <w:t>Пользователь открывает страницу входа.</w:t>
       </w:r>
     </w:p>
     <w:p>
       <w:pPr>
-        <w:spacing w:after="60"/>
+        <w:spacing w:before="0" w:after="60"/>
         <w:jc w:val="both"/>
       </w:pPr>
       <w:r>
         <w:rPr>
-          <w:rFonts w:ascii="Arial" w:hAnsi="Arial" w:eastAsia="Arial"/>
+          <w:rFonts w:ascii="Times New Roman" w:hAnsi="Times New Roman" w:eastAsia="Times New Roman"/>
           <w:b w:val="0"/>
           <w:sz w:val="24"/>
         </w:rPr>
-        <w:t>После нажатия кнопки входа система проверяет учётные данные и активность учётной записи.</w:t>
+        <w:t>Указывает адрес электронной почты и пароль.</w:t>
       </w:r>
     </w:p>
     <w:p>
       <w:pPr>
-        <w:spacing w:after="60"/>
+        <w:spacing w:before="0" w:after="60"/>
         <w:jc w:val="both"/>
       </w:pPr>
       <w:r>
         <w:rPr>
-          <w:rFonts w:ascii="Arial" w:hAnsi="Arial" w:eastAsia="Arial"/>
+          <w:rFonts w:ascii="Times New Roman" w:hAnsi="Times New Roman" w:eastAsia="Times New Roman"/>
           <w:b w:val="0"/>
           <w:sz w:val="24"/>
         </w:rPr>
-        <w:t>При успешной проверке пользователь получает доступ к личному кабинету в соответствии со своей ролью (клиент, партнёр, сотрудник платформы или банк).</w:t>
+        <w:t>После подтверждения система открывает личный кабинет в соответствии с ролью пользователя.</w:t>
       </w:r>
     </w:p>
     <w:p>
@@ -924,67 +901,67 @@
       </w:pPr>
       <w:r>
         <w:rPr>
-          <w:rFonts w:ascii="Arial" w:hAnsi="Arial" w:eastAsia="Arial"/>
+          <w:rFonts w:ascii="Times New Roman" w:hAnsi="Times New Roman" w:eastAsia="Times New Roman"/>
           <w:b/>
           <w:sz w:val="24"/>
         </w:rPr>
-        <w:t>Пример 2. Задача: «Создание заявки на банковскую гарантию»</w:t>
+        <w:t>2. Регистрация пользователя</w:t>
       </w:r>
     </w:p>
     <w:p>
       <w:pPr>
-        <w:spacing w:after="60"/>
+        <w:spacing w:before="0" w:after="60"/>
         <w:jc w:val="both"/>
       </w:pPr>
       <w:r>
         <w:rPr>
-          <w:rFonts w:ascii="Arial" w:hAnsi="Arial" w:eastAsia="Arial"/>
+          <w:rFonts w:ascii="Times New Roman" w:hAnsi="Times New Roman" w:eastAsia="Times New Roman"/>
           <w:b w:val="0"/>
           <w:sz w:val="24"/>
         </w:rPr>
-        <w:t>Авторизованный пользователь (клиент, партнёр или сотрудник платформы) переходит к созданию заявки и выбирает тип продукта «Банковская гарантия».</w:t>
+        <w:t>Пользователь открывает страницу регистрации.</w:t>
       </w:r>
     </w:p>
     <w:p>
       <w:pPr>
-        <w:spacing w:after="60"/>
+        <w:spacing w:before="0" w:after="60"/>
         <w:jc w:val="both"/>
       </w:pPr>
       <w:r>
         <w:rPr>
-          <w:rFonts w:ascii="Arial" w:hAnsi="Arial" w:eastAsia="Arial"/>
+          <w:rFonts w:ascii="Times New Roman" w:hAnsi="Times New Roman" w:eastAsia="Times New Roman"/>
           <w:b w:val="0"/>
           <w:sz w:val="24"/>
         </w:rPr>
-        <w:t>Пользователь указывает ИНН принципала и основные параметры заявки (вид гарантии, сумма или режим установления лимита, срок, сведения о закупке/контракте и иные необходимые данные).</w:t>
+        <w:t>Выбирает тип учётной записи (клиент или партнёр) и заполняет необходимые поля.</w:t>
       </w:r>
     </w:p>
     <w:p>
       <w:pPr>
-        <w:spacing w:after="60"/>
+        <w:spacing w:before="0" w:after="60"/>
         <w:jc w:val="both"/>
       </w:pPr>
       <w:r>
         <w:rPr>
-          <w:rFonts w:ascii="Arial" w:hAnsi="Arial" w:eastAsia="Arial"/>
+          <w:rFonts w:ascii="Times New Roman" w:hAnsi="Times New Roman" w:eastAsia="Times New Roman"/>
           <w:b w:val="0"/>
           <w:sz w:val="24"/>
         </w:rPr>
-        <w:t>Система может автоматически подтянуть сведения о компании по ИНН из доступных источников данных.</w:t>
+        <w:t>После сохранения создаётся учётная запись, и пользователь может войти в личный кабинет.</w:t>
       </w:r>
     </w:p>
     <w:p>
       <w:pPr>
-        <w:spacing w:after="60"/>
+        <w:spacing w:before="0" w:after="60"/>
         <w:jc w:val="both"/>
       </w:pPr>
       <w:r>
         <w:rPr>
-          <w:rFonts w:ascii="Arial" w:hAnsi="Arial" w:eastAsia="Arial"/>
+          <w:rFonts w:ascii="Times New Roman" w:hAnsi="Times New Roman" w:eastAsia="Times New Roman"/>
           <w:b w:val="0"/>
           <w:sz w:val="24"/>
         </w:rPr>
-        <w:t>После сохранения создаётся карточка заявки со стартовым набором документов и статусом, соответствующим этапу обработки.</w:t>
+        <w:t>Учётные записи иных ролей (сотрудники платформы, банк, заказчик) создаются уполномоченными пользователями в разделе администрирования.</w:t>
       </w:r>
     </w:p>
     <w:p>
@@ -994,53 +971,53 @@
       </w:pPr>
       <w:r>
         <w:rPr>
-          <w:rFonts w:ascii="Arial" w:hAnsi="Arial" w:eastAsia="Arial"/>
+          <w:rFonts w:ascii="Times New Roman" w:hAnsi="Times New Roman" w:eastAsia="Times New Roman"/>
           <w:b/>
           <w:sz w:val="24"/>
         </w:rPr>
-        <w:t>Пример 3. Задача: «Работа менеджера с заявкой и продуктами»</w:t>
+        <w:t>3. Работа с профилем личного кабинета</w:t>
       </w:r>
     </w:p>
     <w:p>
       <w:pPr>
-        <w:spacing w:after="60"/>
+        <w:spacing w:before="0" w:after="60"/>
         <w:jc w:val="both"/>
       </w:pPr>
       <w:r>
         <w:rPr>
-          <w:rFonts w:ascii="Arial" w:hAnsi="Arial" w:eastAsia="Arial"/>
+          <w:rFonts w:ascii="Times New Roman" w:hAnsi="Times New Roman" w:eastAsia="Times New Roman"/>
           <w:b w:val="0"/>
           <w:sz w:val="24"/>
         </w:rPr>
-        <w:t>Сотрудник платформы открывает карточку заявки, проверяет сведения и документы, при необходимости назначает ответственного.</w:t>
+        <w:t>Пользователь открывает раздел личного кабинета.</w:t>
       </w:r>
     </w:p>
     <w:p>
       <w:pPr>
-        <w:spacing w:after="60"/>
+        <w:spacing w:before="0" w:after="60"/>
         <w:jc w:val="both"/>
       </w:pPr>
       <w:r>
         <w:rPr>
-          <w:rFonts w:ascii="Arial" w:hAnsi="Arial" w:eastAsia="Arial"/>
+          <w:rFonts w:ascii="Times New Roman" w:hAnsi="Times New Roman" w:eastAsia="Times New Roman"/>
           <w:b w:val="0"/>
           <w:sz w:val="24"/>
         </w:rPr>
-        <w:t>В разделе продуктов сотрудник подбирает и добавляет банковские продукты, ведёт их статусы, запрашивает недостающие документы и ведёт переписку в чатах.</w:t>
+        <w:t>Просматривает и при необходимости изменяет сведения профиля, параметры уведомлений, пароль.</w:t>
       </w:r>
     </w:p>
     <w:p>
       <w:pPr>
-        <w:spacing w:after="60"/>
+        <w:spacing w:before="0" w:after="60"/>
         <w:jc w:val="both"/>
       </w:pPr>
       <w:r>
         <w:rPr>
-          <w:rFonts w:ascii="Arial" w:hAnsi="Arial" w:eastAsia="Arial"/>
+          <w:rFonts w:ascii="Times New Roman" w:hAnsi="Times New Roman" w:eastAsia="Times New Roman"/>
           <w:b w:val="0"/>
           <w:sz w:val="24"/>
         </w:rPr>
-        <w:t>При готовности пакета сотрудник формирует и отправляет обращение в банк через модуль работы с банком.</w:t>
+        <w:t>Сохраняет изменения.</w:t>
       </w:r>
     </w:p>
     <w:p>
@@ -1050,123 +1027,165 @@
       </w:pPr>
       <w:r>
         <w:rPr>
-          <w:rFonts w:ascii="Arial" w:hAnsi="Arial" w:eastAsia="Arial"/>
+          <w:rFonts w:ascii="Times New Roman" w:hAnsi="Times New Roman" w:eastAsia="Times New Roman"/>
           <w:b/>
           <w:sz w:val="24"/>
         </w:rPr>
-        <w:t>Пример 4. Задача: «Обработка заявки в личном кабинете банка»</w:t>
+        <w:t>4. Обращение в поддержку</w:t>
       </w:r>
     </w:p>
     <w:p>
       <w:pPr>
-        <w:spacing w:after="60"/>
+        <w:spacing w:before="0" w:after="60"/>
         <w:jc w:val="both"/>
       </w:pPr>
       <w:r>
         <w:rPr>
-          <w:rFonts w:ascii="Arial" w:hAnsi="Arial" w:eastAsia="Arial"/>
+          <w:rFonts w:ascii="Times New Roman" w:hAnsi="Times New Roman" w:eastAsia="Times New Roman"/>
           <w:b w:val="0"/>
           <w:sz w:val="24"/>
         </w:rPr>
-        <w:t>Пользователь с ролью «Банк» входит в личный кабинет банка и открывает поступившую заявку (банковский кейс).</w:t>
+        <w:t>Пользователь открывает раздел поддержки.</w:t>
       </w:r>
     </w:p>
     <w:p>
       <w:pPr>
-        <w:spacing w:after="60"/>
+        <w:spacing w:before="0" w:after="60"/>
         <w:jc w:val="both"/>
       </w:pPr>
       <w:r>
         <w:rPr>
-          <w:rFonts w:ascii="Arial" w:hAnsi="Arial" w:eastAsia="Arial"/>
+          <w:rFonts w:ascii="Times New Roman" w:hAnsi="Times New Roman" w:eastAsia="Times New Roman"/>
           <w:b w:val="0"/>
           <w:sz w:val="24"/>
         </w:rPr>
-        <w:t>Банк просматривает сведения заявки, пакет документов, аналитику и структуру принципала, при необходимости ведёт переписку с менеджером.</w:t>
+        <w:t>Создаёт обращение и ведёт переписку по обращению.</w:t>
       </w:r>
     </w:p>
     <w:p>
       <w:pPr>
-        <w:spacing w:after="60"/>
+        <w:spacing w:before="0" w:after="60"/>
         <w:jc w:val="both"/>
       </w:pPr>
       <w:r>
         <w:rPr>
-          <w:rFonts w:ascii="Arial" w:hAnsi="Arial" w:eastAsia="Arial"/>
+          <w:rFonts w:ascii="Times New Roman" w:hAnsi="Times New Roman" w:eastAsia="Times New Roman"/>
           <w:b w:val="0"/>
           <w:sz w:val="24"/>
         </w:rPr>
-        <w:t>Банк устанавливает статус рассмотрения (в работе, запрос, одобрение, выдача банковской гарантии, отказ и др.) и фиксирует комментарии/вложения.</w:t>
+        <w:t>Просматривает статус обращения.</w:t>
       </w:r>
     </w:p>
     <w:p>
       <w:pPr>
-        <w:spacing w:after="60"/>
+        <w:spacing w:before="240" w:after="120"/>
         <w:jc w:val="both"/>
       </w:pPr>
       <w:r>
         <w:rPr>
-          <w:rFonts w:ascii="Arial" w:hAnsi="Arial" w:eastAsia="Arial"/>
+          <w:rFonts w:ascii="Times New Roman" w:hAnsi="Times New Roman" w:eastAsia="Times New Roman"/>
+          <w:b/>
+          <w:sz w:val="26"/>
+        </w:rPr>
+        <w:t>Сценарии клиента и партнёра</w:t>
+      </w:r>
+    </w:p>
+    <w:p>
+      <w:pPr>
+        <w:spacing w:before="200" w:after="80"/>
+        <w:jc w:val="both"/>
+      </w:pPr>
+      <w:r>
+        <w:rPr>
+          <w:rFonts w:ascii="Times New Roman" w:hAnsi="Times New Roman" w:eastAsia="Times New Roman"/>
+          <w:b/>
+          <w:sz w:val="24"/>
+        </w:rPr>
+        <w:t>5. Просмотр главной страницы кабинета</w:t>
+      </w:r>
+    </w:p>
+    <w:p>
+      <w:pPr>
+        <w:spacing w:before="0" w:after="60"/>
+        <w:jc w:val="both"/>
+      </w:pPr>
+      <w:r>
+        <w:rPr>
+          <w:rFonts w:ascii="Times New Roman" w:hAnsi="Times New Roman" w:eastAsia="Times New Roman"/>
           <w:b w:val="0"/>
           <w:sz w:val="24"/>
         </w:rPr>
-        <w:t>При наличии соответствующей настройки портала банка доступна вкладка банковской методики для оценки кредитоспособности принципала.</w:t>
+        <w:t>После входа пользователь видит сводку по своим заявкам и доступные быстрые действия.</w:t>
       </w:r>
     </w:p>
     <w:p>
       <w:pPr>
+        <w:spacing w:before="0" w:after="60"/>
+        <w:jc w:val="both"/>
+      </w:pPr>
+      <w:r>
+        <w:rPr>
+          <w:rFonts w:ascii="Times New Roman" w:hAnsi="Times New Roman" w:eastAsia="Times New Roman"/>
+          <w:b w:val="0"/>
+          <w:sz w:val="24"/>
+        </w:rPr>
+        <w:t>Из главной страницы можно перейти к списку заявок или к созданию новой заявки.</w:t>
+      </w:r>
+    </w:p>
+    <w:p>
+      <w:pPr>
         <w:spacing w:before="200" w:after="80"/>
         <w:jc w:val="both"/>
       </w:pPr>
       <w:r>
         <w:rPr>
-          <w:rFonts w:ascii="Arial" w:hAnsi="Arial" w:eastAsia="Arial"/>
+          <w:rFonts w:ascii="Times New Roman" w:hAnsi="Times New Roman" w:eastAsia="Times New Roman"/>
           <w:b/>
           <w:sz w:val="24"/>
         </w:rPr>
-        <w:t>Пример 5. Задача: «Проведение банковской методики»</w:t>
+        <w:t>6. Просмотр списка заявок</w:t>
       </w:r>
     </w:p>
     <w:p>
       <w:pPr>
-        <w:spacing w:after="60"/>
+        <w:spacing w:before="0" w:after="60"/>
         <w:jc w:val="both"/>
       </w:pPr>
       <w:r>
         <w:rPr>
-          <w:rFonts w:ascii="Arial" w:hAnsi="Arial" w:eastAsia="Arial"/>
+          <w:rFonts w:ascii="Times New Roman" w:hAnsi="Times New Roman" w:eastAsia="Times New Roman"/>
           <w:b w:val="0"/>
           <w:sz w:val="24"/>
         </w:rPr>
-        <w:t>Пользователь с правом доступа к банковской методике открывает соответствующую вкладку в карточке заявки.</w:t>
+        <w:t>Пользователь открывает раздел заявок.</w:t>
       </w:r>
     </w:p>
     <w:p>
       <w:pPr>
-        <w:spacing w:after="60"/>
+        <w:spacing w:before="0" w:after="60"/>
         <w:jc w:val="both"/>
       </w:pPr>
       <w:r>
         <w:rPr>
-          <w:rFonts w:ascii="Arial" w:hAnsi="Arial" w:eastAsia="Arial"/>
+          <w:rFonts w:ascii="Times New Roman" w:hAnsi="Times New Roman" w:eastAsia="Times New Roman"/>
           <w:b w:val="0"/>
           <w:sz w:val="24"/>
         </w:rPr>
-        <w:t>Заполняются (вручную и/или с автоподстановкой) стоп-факторы, финансовые показатели и показатели бизнес-риска; система рассчитывает баллы и предварительный рейтинг.</w:t>
+        <w:t>Видит список своих заявок со статусами.</w:t>
       </w:r>
     </w:p>
     <w:p>
       <w:pPr>
-        <w:spacing w:after="60"/>
+        <w:spacing w:before="0" w:after="60"/>
         <w:jc w:val="both"/>
       </w:pPr>
       <w:r>
         <w:rPr>
-          <w:rFonts w:ascii="Arial" w:hAnsi="Arial" w:eastAsia="Arial"/>
+          <w:rFonts w:ascii="Times New Roman" w:hAnsi="Times New Roman" w:eastAsia="Times New Roman"/>
           <w:b w:val="0"/>
           <w:sz w:val="24"/>
         </w:rPr>
-        <w:t>Пользователь при необходимости вносит профсуждение, сохраняет черновик и фиксирует официальную версию оценки. История версий сохраняется в системе.</w:t>
+        <w:t>Может воспользоваться поиском и фильтрами, открыть карточку выбранной заявки.</w:t>
       </w:r>
     </w:p>
     <w:p>
@@ -1176,53 +1195,53 @@
       </w:pPr>
       <w:r>
         <w:rPr>
-          <w:rFonts w:ascii="Arial" w:hAnsi="Arial" w:eastAsia="Arial"/>
+          <w:rFonts w:ascii="Times New Roman" w:hAnsi="Times New Roman" w:eastAsia="Times New Roman"/>
           <w:b/>
           <w:sz w:val="24"/>
         </w:rPr>
-        <w:t>Пример 6. Задача: «Получение аналитики по компании»</w:t>
+        <w:t>7. Создание заявки на банковскую гарантию</w:t>
       </w:r>
     </w:p>
     <w:p>
       <w:pPr>
-        <w:spacing w:after="60"/>
+        <w:spacing w:before="0" w:after="60"/>
         <w:jc w:val="both"/>
       </w:pPr>
       <w:r>
         <w:rPr>
-          <w:rFonts w:ascii="Arial" w:hAnsi="Arial" w:eastAsia="Arial"/>
+          <w:rFonts w:ascii="Times New Roman" w:hAnsi="Times New Roman" w:eastAsia="Times New Roman"/>
           <w:b w:val="0"/>
           <w:sz w:val="24"/>
         </w:rPr>
-        <w:t>Пользователь переходит в инструмент «Аналитика по ИНН» (либо открывает вкладку аналитики в карточке заявки) и указывает ИНН организации.</w:t>
+        <w:t>Пользователь выбирает создание заявки и указывает тип «Банковская гарантия».</w:t>
       </w:r>
     </w:p>
     <w:p>
       <w:pPr>
-        <w:spacing w:after="60"/>
+        <w:spacing w:before="0" w:after="60"/>
         <w:jc w:val="both"/>
       </w:pPr>
       <w:r>
         <w:rPr>
-          <w:rFonts w:ascii="Arial" w:hAnsi="Arial" w:eastAsia="Arial"/>
+          <w:rFonts w:ascii="Times New Roman" w:hAnsi="Times New Roman" w:eastAsia="Times New Roman"/>
           <w:b w:val="0"/>
           <w:sz w:val="24"/>
         </w:rPr>
-        <w:t>Система запрашивает и отображает результаты анализа (скоринг/рейтинг, ключевые факторы, сведения из доступных источников).</w:t>
+        <w:t>Заполняет сведения о принципале и параметры заявки.</w:t>
       </w:r>
     </w:p>
     <w:p>
       <w:pPr>
-        <w:spacing w:after="60"/>
+        <w:spacing w:before="0" w:after="60"/>
         <w:jc w:val="both"/>
       </w:pPr>
       <w:r>
         <w:rPr>
-          <w:rFonts w:ascii="Arial" w:hAnsi="Arial" w:eastAsia="Arial"/>
+          <w:rFonts w:ascii="Times New Roman" w:hAnsi="Times New Roman" w:eastAsia="Times New Roman"/>
           <w:b w:val="0"/>
           <w:sz w:val="24"/>
         </w:rPr>
-        <w:t>Результаты могут использоваться для принятия решения о дальнейшей работе с заявкой и сохраняться в истории запросов.</w:t>
+        <w:t>Сохраняет заявку. Система создаёт карточку заявки и разделы для дальнейшей работы.</w:t>
       </w:r>
     </w:p>
     <w:p>
@@ -1232,63 +1251,1309 @@
       </w:pPr>
       <w:r>
         <w:rPr>
-          <w:rFonts w:ascii="Arial" w:hAnsi="Arial" w:eastAsia="Arial"/>
+          <w:rFonts w:ascii="Times New Roman" w:hAnsi="Times New Roman" w:eastAsia="Times New Roman"/>
           <w:b/>
           <w:sz w:val="24"/>
         </w:rPr>
-        <w:t>Пример 7. Задача: «Администрирование пользователей и прав»</w:t>
+        <w:t>8. Создание заявки на кредитный продукт</w:t>
       </w:r>
     </w:p>
     <w:p>
       <w:pPr>
-        <w:spacing w:after="60"/>
+        <w:spacing w:before="0" w:after="60"/>
         <w:jc w:val="both"/>
       </w:pPr>
       <w:r>
         <w:rPr>
-          <w:rFonts w:ascii="Arial" w:hAnsi="Arial" w:eastAsia="Arial"/>
+          <w:rFonts w:ascii="Times New Roman" w:hAnsi="Times New Roman" w:eastAsia="Times New Roman"/>
           <w:b w:val="0"/>
           <w:sz w:val="24"/>
         </w:rPr>
-        <w:t>Пользователь с соответствующими правами открывает раздел администрирования пользователей и создаёт учётную запись нужной роли.</w:t>
+        <w:t>Пользователь выбирает создание заявки и указывает кредитный продукт.</w:t>
       </w:r>
     </w:p>
     <w:p>
       <w:pPr>
-        <w:spacing w:after="60"/>
+        <w:spacing w:before="0" w:after="60"/>
         <w:jc w:val="both"/>
       </w:pPr>
       <w:r>
         <w:rPr>
-          <w:rFonts w:ascii="Arial" w:hAnsi="Arial" w:eastAsia="Arial"/>
+          <w:rFonts w:ascii="Times New Roman" w:hAnsi="Times New Roman" w:eastAsia="Times New Roman"/>
           <w:b w:val="0"/>
           <w:sz w:val="24"/>
         </w:rPr>
-        <w:t>При необходимости в разделе «Права доступа» настраивается матрица полномочий ролей сотрудников платформы.</w:t>
+        <w:t>Заполняет параметры заявки и сохраняет её.</w:t>
       </w:r>
     </w:p>
     <w:p>
       <w:pPr>
-        <w:spacing w:after="60"/>
+        <w:spacing w:before="0" w:after="60"/>
         <w:jc w:val="both"/>
       </w:pPr>
       <w:r>
         <w:rPr>
-          <w:rFonts w:ascii="Arial" w:hAnsi="Arial" w:eastAsia="Arial"/>
+          <w:rFonts w:ascii="Times New Roman" w:hAnsi="Times New Roman" w:eastAsia="Times New Roman"/>
           <w:b w:val="0"/>
           <w:sz w:val="24"/>
         </w:rPr>
-        <w:t>Изменения применяются к работе пользователей в соответствии с установленными правами.</w:t>
+        <w:t>Система создаёт карточку заявки для последующего сопровождения.</w:t>
       </w:r>
     </w:p>
     <w:p>
       <w:pPr>
+        <w:spacing w:before="200" w:after="80"/>
+        <w:jc w:val="both"/>
+      </w:pPr>
+      <w:r>
+        <w:rPr>
+          <w:rFonts w:ascii="Times New Roman" w:hAnsi="Times New Roman" w:eastAsia="Times New Roman"/>
+          <w:b/>
+          <w:sz w:val="24"/>
+        </w:rPr>
+        <w:t>9. Работа с карточкой заявки</w:t>
+      </w:r>
+    </w:p>
+    <w:p>
+      <w:pPr>
+        <w:spacing w:before="0" w:after="60"/>
+        <w:jc w:val="both"/>
+      </w:pPr>
+      <w:r>
+        <w:rPr>
+          <w:rFonts w:ascii="Times New Roman" w:hAnsi="Times New Roman" w:eastAsia="Times New Roman"/>
+          <w:b w:val="0"/>
+          <w:sz w:val="24"/>
+        </w:rPr>
+        <w:t>Пользователь открывает заявку и переключается между доступными вкладками карточки.</w:t>
+      </w:r>
+    </w:p>
+    <w:p>
+      <w:pPr>
+        <w:spacing w:before="0" w:after="60"/>
+        <w:jc w:val="both"/>
+      </w:pPr>
+      <w:r>
+        <w:rPr>
+          <w:rFonts w:ascii="Times New Roman" w:hAnsi="Times New Roman" w:eastAsia="Times New Roman"/>
+          <w:b w:val="0"/>
+          <w:sz w:val="24"/>
+        </w:rPr>
+        <w:t>В разделе информации просматривает основные сведения и текущий статус.</w:t>
+      </w:r>
+    </w:p>
+    <w:p>
+      <w:pPr>
+        <w:spacing w:before="0" w:after="60"/>
+        <w:jc w:val="both"/>
+      </w:pPr>
+      <w:r>
+        <w:rPr>
+          <w:rFonts w:ascii="Times New Roman" w:hAnsi="Times New Roman" w:eastAsia="Times New Roman"/>
+          <w:b w:val="0"/>
+          <w:sz w:val="24"/>
+        </w:rPr>
+        <w:t>В разделе продуктов видит подобранные банковские продукты и их статусы.</w:t>
+      </w:r>
+    </w:p>
+    <w:p>
+      <w:pPr>
+        <w:spacing w:before="0" w:after="60"/>
+        <w:jc w:val="both"/>
+      </w:pPr>
+      <w:r>
+        <w:rPr>
+          <w:rFonts w:ascii="Times New Roman" w:hAnsi="Times New Roman" w:eastAsia="Times New Roman"/>
+          <w:b w:val="0"/>
+          <w:sz w:val="24"/>
+        </w:rPr>
+        <w:t>В разделе документов загружает и просматривает файлы, при необходимости выгружает комплект.</w:t>
+      </w:r>
+    </w:p>
+    <w:p>
+      <w:pPr>
+        <w:spacing w:before="0" w:after="60"/>
+        <w:jc w:val="both"/>
+      </w:pPr>
+      <w:r>
+        <w:rPr>
+          <w:rFonts w:ascii="Times New Roman" w:hAnsi="Times New Roman" w:eastAsia="Times New Roman"/>
+          <w:b w:val="0"/>
+          <w:sz w:val="24"/>
+        </w:rPr>
+        <w:t>В разделе аналитики просматривает доступные результаты анализа по компании.</w:t>
+      </w:r>
+    </w:p>
+    <w:p>
+      <w:pPr>
+        <w:spacing w:before="0" w:after="60"/>
+        <w:jc w:val="both"/>
+      </w:pPr>
+      <w:r>
+        <w:rPr>
+          <w:rFonts w:ascii="Times New Roman" w:hAnsi="Times New Roman" w:eastAsia="Times New Roman"/>
+          <w:b w:val="0"/>
+          <w:sz w:val="24"/>
+        </w:rPr>
+        <w:t>В чате ведёт переписку по заявке.</w:t>
+      </w:r>
+    </w:p>
+    <w:p>
+      <w:pPr>
+        <w:spacing w:before="200" w:after="80"/>
+        <w:jc w:val="both"/>
+      </w:pPr>
+      <w:r>
+        <w:rPr>
+          <w:rFonts w:ascii="Times New Roman" w:hAnsi="Times New Roman" w:eastAsia="Times New Roman"/>
+          <w:b/>
+          <w:sz w:val="24"/>
+        </w:rPr>
+        <w:t>10. Использование инструментов подбора и расчёта</w:t>
+      </w:r>
+    </w:p>
+    <w:p>
+      <w:pPr>
+        <w:spacing w:before="0" w:after="60"/>
+        <w:jc w:val="both"/>
+      </w:pPr>
+      <w:r>
+        <w:rPr>
+          <w:rFonts w:ascii="Times New Roman" w:hAnsi="Times New Roman" w:eastAsia="Times New Roman"/>
+          <w:b w:val="0"/>
+          <w:sz w:val="24"/>
+        </w:rPr>
+        <w:t>Пользователь открывает инструмент подбора продуктов и задаёт параметры поиска.</w:t>
+      </w:r>
+    </w:p>
+    <w:p>
+      <w:pPr>
+        <w:spacing w:before="0" w:after="60"/>
+        <w:jc w:val="both"/>
+      </w:pPr>
+      <w:r>
+        <w:rPr>
+          <w:rFonts w:ascii="Times New Roman" w:hAnsi="Times New Roman" w:eastAsia="Times New Roman"/>
+          <w:b w:val="0"/>
+          <w:sz w:val="24"/>
+        </w:rPr>
+        <w:t>Система отображает подходящие варианты.</w:t>
+      </w:r>
+    </w:p>
+    <w:p>
+      <w:pPr>
+        <w:spacing w:before="0" w:after="60"/>
+        <w:jc w:val="both"/>
+      </w:pPr>
+      <w:r>
+        <w:rPr>
+          <w:rFonts w:ascii="Times New Roman" w:hAnsi="Times New Roman" w:eastAsia="Times New Roman"/>
+          <w:b w:val="0"/>
+          <w:sz w:val="24"/>
+        </w:rPr>
+        <w:t>Пользователь может открыть инструмент расчёта лимитов, указать исходные данные и получить результат расчёта.</w:t>
+      </w:r>
+    </w:p>
+    <w:p>
+      <w:pPr>
+        <w:spacing w:before="200" w:after="80"/>
+        <w:jc w:val="both"/>
+      </w:pPr>
+      <w:r>
+        <w:rPr>
+          <w:rFonts w:ascii="Times New Roman" w:hAnsi="Times New Roman" w:eastAsia="Times New Roman"/>
+          <w:b/>
+          <w:sz w:val="24"/>
+        </w:rPr>
+        <w:t>11. Аналитика по компании</w:t>
+      </w:r>
+    </w:p>
+    <w:p>
+      <w:pPr>
+        <w:spacing w:before="0" w:after="60"/>
+        <w:jc w:val="both"/>
+      </w:pPr>
+      <w:r>
+        <w:rPr>
+          <w:rFonts w:ascii="Times New Roman" w:hAnsi="Times New Roman" w:eastAsia="Times New Roman"/>
+          <w:b w:val="0"/>
+          <w:sz w:val="24"/>
+        </w:rPr>
+        <w:t>Пользователь открывает инструмент аналитики и указывает идентификатор организации.</w:t>
+      </w:r>
+    </w:p>
+    <w:p>
+      <w:pPr>
+        <w:spacing w:before="0" w:after="60"/>
+        <w:jc w:val="both"/>
+      </w:pPr>
+      <w:r>
+        <w:rPr>
+          <w:rFonts w:ascii="Times New Roman" w:hAnsi="Times New Roman" w:eastAsia="Times New Roman"/>
+          <w:b w:val="0"/>
+          <w:sz w:val="24"/>
+        </w:rPr>
+        <w:t>Система отображает результат анализа.</w:t>
+      </w:r>
+    </w:p>
+    <w:p>
+      <w:pPr>
+        <w:spacing w:before="0" w:after="60"/>
+        <w:jc w:val="both"/>
+      </w:pPr>
+      <w:r>
+        <w:rPr>
+          <w:rFonts w:ascii="Times New Roman" w:hAnsi="Times New Roman" w:eastAsia="Times New Roman"/>
+          <w:b w:val="0"/>
+          <w:sz w:val="24"/>
+        </w:rPr>
+        <w:t>Пользователь может просмотреть историю ранее выполненных запросов.</w:t>
+      </w:r>
+    </w:p>
+    <w:p>
+      <w:pPr>
         <w:spacing w:before="240" w:after="120"/>
         <w:jc w:val="both"/>
       </w:pPr>
       <w:r>
         <w:rPr>
-          <w:rFonts w:ascii="Arial" w:hAnsi="Arial" w:eastAsia="Arial"/>
+          <w:rFonts w:ascii="Times New Roman" w:hAnsi="Times New Roman" w:eastAsia="Times New Roman"/>
+          <w:b/>
+          <w:sz w:val="26"/>
+        </w:rPr>
+        <w:t>Сценарии заказчика</w:t>
+      </w:r>
+    </w:p>
+    <w:p>
+      <w:pPr>
+        <w:spacing w:before="200" w:after="80"/>
+        <w:jc w:val="both"/>
+      </w:pPr>
+      <w:r>
+        <w:rPr>
+          <w:rFonts w:ascii="Times New Roman" w:hAnsi="Times New Roman" w:eastAsia="Times New Roman"/>
+          <w:b/>
+          <w:sz w:val="24"/>
+        </w:rPr>
+        <w:t>12. Инициация заявки заказчиком</w:t>
+      </w:r>
+    </w:p>
+    <w:p>
+      <w:pPr>
+        <w:spacing w:before="0" w:after="60"/>
+        <w:jc w:val="both"/>
+      </w:pPr>
+      <w:r>
+        <w:rPr>
+          <w:rFonts w:ascii="Times New Roman" w:hAnsi="Times New Roman" w:eastAsia="Times New Roman"/>
+          <w:b w:val="0"/>
+          <w:sz w:val="24"/>
+        </w:rPr>
+        <w:t>Пользователь с ролью заказчика создаёт заявку на банковскую гарантию и указывает необходимые сведения.</w:t>
+      </w:r>
+    </w:p>
+    <w:p>
+      <w:pPr>
+        <w:spacing w:before="0" w:after="60"/>
+        <w:jc w:val="both"/>
+      </w:pPr>
+      <w:r>
+        <w:rPr>
+          <w:rFonts w:ascii="Times New Roman" w:hAnsi="Times New Roman" w:eastAsia="Times New Roman"/>
+          <w:b w:val="0"/>
+          <w:sz w:val="24"/>
+        </w:rPr>
+        <w:t>Заявка поступает на рассмотрение сотруднику платформы.</w:t>
+      </w:r>
+    </w:p>
+    <w:p>
+      <w:pPr>
+        <w:spacing w:before="0" w:after="60"/>
+        <w:jc w:val="both"/>
+      </w:pPr>
+      <w:r>
+        <w:rPr>
+          <w:rFonts w:ascii="Times New Roman" w:hAnsi="Times New Roman" w:eastAsia="Times New Roman"/>
+          <w:b w:val="0"/>
+          <w:sz w:val="24"/>
+        </w:rPr>
+        <w:t>После рассмотрения заказчик видит результат и может продолжить взаимодействие в рамках заявки, в том числе в чате.</w:t>
+      </w:r>
+    </w:p>
+    <w:p>
+      <w:pPr>
+        <w:spacing w:before="240" w:after="120"/>
+        <w:jc w:val="both"/>
+      </w:pPr>
+      <w:r>
+        <w:rPr>
+          <w:rFonts w:ascii="Times New Roman" w:hAnsi="Times New Roman" w:eastAsia="Times New Roman"/>
+          <w:b/>
+          <w:sz w:val="26"/>
+        </w:rPr>
+        <w:t>Сценарии сотрудников платформы (менеджер, менеджер по заявкам, руководитель)</w:t>
+      </w:r>
+    </w:p>
+    <w:p>
+      <w:pPr>
+        <w:spacing w:before="200" w:after="80"/>
+        <w:jc w:val="both"/>
+      </w:pPr>
+      <w:r>
+        <w:rPr>
+          <w:rFonts w:ascii="Times New Roman" w:hAnsi="Times New Roman" w:eastAsia="Times New Roman"/>
+          <w:b/>
+          <w:sz w:val="24"/>
+        </w:rPr>
+        <w:t>13. Работа со списком заявок</w:t>
+      </w:r>
+    </w:p>
+    <w:p>
+      <w:pPr>
+        <w:spacing w:before="0" w:after="60"/>
+        <w:jc w:val="both"/>
+      </w:pPr>
+      <w:r>
+        <w:rPr>
+          <w:rFonts w:ascii="Times New Roman" w:hAnsi="Times New Roman" w:eastAsia="Times New Roman"/>
+          <w:b w:val="0"/>
+          <w:sz w:val="24"/>
+        </w:rPr>
+        <w:t>Сотрудник открывает раздел заявок.</w:t>
+      </w:r>
+    </w:p>
+    <w:p>
+      <w:pPr>
+        <w:spacing w:before="0" w:after="60"/>
+        <w:jc w:val="both"/>
+      </w:pPr>
+      <w:r>
+        <w:rPr>
+          <w:rFonts w:ascii="Times New Roman" w:hAnsi="Times New Roman" w:eastAsia="Times New Roman"/>
+          <w:b w:val="0"/>
+          <w:sz w:val="24"/>
+        </w:rPr>
+        <w:t>Видит заявки в соответствии со своими правами.</w:t>
+      </w:r>
+    </w:p>
+    <w:p>
+      <w:pPr>
+        <w:spacing w:before="0" w:after="60"/>
+        <w:jc w:val="both"/>
+      </w:pPr>
+      <w:r>
+        <w:rPr>
+          <w:rFonts w:ascii="Times New Roman" w:hAnsi="Times New Roman" w:eastAsia="Times New Roman"/>
+          <w:b w:val="0"/>
+          <w:sz w:val="24"/>
+        </w:rPr>
+        <w:t>Использует фильтры, поиск и открывает нужную карточку.</w:t>
+      </w:r>
+    </w:p>
+    <w:p>
+      <w:pPr>
+        <w:spacing w:before="200" w:after="80"/>
+        <w:jc w:val="both"/>
+      </w:pPr>
+      <w:r>
+        <w:rPr>
+          <w:rFonts w:ascii="Times New Roman" w:hAnsi="Times New Roman" w:eastAsia="Times New Roman"/>
+          <w:b/>
+          <w:sz w:val="24"/>
+        </w:rPr>
+        <w:t>14. Назначение ответственного и ведение заявки</w:t>
+      </w:r>
+    </w:p>
+    <w:p>
+      <w:pPr>
+        <w:spacing w:before="0" w:after="60"/>
+        <w:jc w:val="both"/>
+      </w:pPr>
+      <w:r>
+        <w:rPr>
+          <w:rFonts w:ascii="Times New Roman" w:hAnsi="Times New Roman" w:eastAsia="Times New Roman"/>
+          <w:b w:val="0"/>
+          <w:sz w:val="24"/>
+        </w:rPr>
+        <w:t>Сотрудник открывает карточку заявки.</w:t>
+      </w:r>
+    </w:p>
+    <w:p>
+      <w:pPr>
+        <w:spacing w:before="0" w:after="60"/>
+        <w:jc w:val="both"/>
+      </w:pPr>
+      <w:r>
+        <w:rPr>
+          <w:rFonts w:ascii="Times New Roman" w:hAnsi="Times New Roman" w:eastAsia="Times New Roman"/>
+          <w:b w:val="0"/>
+          <w:sz w:val="24"/>
+        </w:rPr>
+        <w:t>При наличии права назначает или изменяет ответственного.</w:t>
+      </w:r>
+    </w:p>
+    <w:p>
+      <w:pPr>
+        <w:spacing w:before="0" w:after="60"/>
+        <w:jc w:val="both"/>
+      </w:pPr>
+      <w:r>
+        <w:rPr>
+          <w:rFonts w:ascii="Times New Roman" w:hAnsi="Times New Roman" w:eastAsia="Times New Roman"/>
+          <w:b w:val="0"/>
+          <w:sz w:val="24"/>
+        </w:rPr>
+        <w:t>Контролирует статусы заявки и заполненность разделов карточки.</w:t>
+      </w:r>
+    </w:p>
+    <w:p>
+      <w:pPr>
+        <w:spacing w:before="200" w:after="80"/>
+        <w:jc w:val="both"/>
+      </w:pPr>
+      <w:r>
+        <w:rPr>
+          <w:rFonts w:ascii="Times New Roman" w:hAnsi="Times New Roman" w:eastAsia="Times New Roman"/>
+          <w:b/>
+          <w:sz w:val="24"/>
+        </w:rPr>
+        <w:t>15. Подбор и ведение продуктов по заявке</w:t>
+      </w:r>
+    </w:p>
+    <w:p>
+      <w:pPr>
+        <w:spacing w:before="0" w:after="60"/>
+        <w:jc w:val="both"/>
+      </w:pPr>
+      <w:r>
+        <w:rPr>
+          <w:rFonts w:ascii="Times New Roman" w:hAnsi="Times New Roman" w:eastAsia="Times New Roman"/>
+          <w:b w:val="0"/>
+          <w:sz w:val="24"/>
+        </w:rPr>
+        <w:t>В карточке заявки сотрудник открывает раздел продуктов.</w:t>
+      </w:r>
+    </w:p>
+    <w:p>
+      <w:pPr>
+        <w:spacing w:before="0" w:after="60"/>
+        <w:jc w:val="both"/>
+      </w:pPr>
+      <w:r>
+        <w:rPr>
+          <w:rFonts w:ascii="Times New Roman" w:hAnsi="Times New Roman" w:eastAsia="Times New Roman"/>
+          <w:b w:val="0"/>
+          <w:sz w:val="24"/>
+        </w:rPr>
+        <w:t>Добавляет банковские продукты, ведёт их статусы и сопутствующие сведения.</w:t>
+      </w:r>
+    </w:p>
+    <w:p>
+      <w:pPr>
+        <w:spacing w:before="0" w:after="60"/>
+        <w:jc w:val="both"/>
+      </w:pPr>
+      <w:r>
+        <w:rPr>
+          <w:rFonts w:ascii="Times New Roman" w:hAnsi="Times New Roman" w:eastAsia="Times New Roman"/>
+          <w:b w:val="0"/>
+          <w:sz w:val="24"/>
+        </w:rPr>
+        <w:t>При необходимости удаляет неактуальные продукты.</w:t>
+      </w:r>
+    </w:p>
+    <w:p>
+      <w:pPr>
+        <w:spacing w:before="200" w:after="80"/>
+        <w:jc w:val="both"/>
+      </w:pPr>
+      <w:r>
+        <w:rPr>
+          <w:rFonts w:ascii="Times New Roman" w:hAnsi="Times New Roman" w:eastAsia="Times New Roman"/>
+          <w:b/>
+          <w:sz w:val="24"/>
+        </w:rPr>
+        <w:t>16. Работа с документами и запросами документов</w:t>
+      </w:r>
+    </w:p>
+    <w:p>
+      <w:pPr>
+        <w:spacing w:before="0" w:after="60"/>
+        <w:jc w:val="both"/>
+      </w:pPr>
+      <w:r>
+        <w:rPr>
+          <w:rFonts w:ascii="Times New Roman" w:hAnsi="Times New Roman" w:eastAsia="Times New Roman"/>
+          <w:b w:val="0"/>
+          <w:sz w:val="24"/>
+        </w:rPr>
+        <w:t>Сотрудник открывает раздел документов заявки или документов продукта.</w:t>
+      </w:r>
+    </w:p>
+    <w:p>
+      <w:pPr>
+        <w:spacing w:before="0" w:after="60"/>
+        <w:jc w:val="both"/>
+      </w:pPr>
+      <w:r>
+        <w:rPr>
+          <w:rFonts w:ascii="Times New Roman" w:hAnsi="Times New Roman" w:eastAsia="Times New Roman"/>
+          <w:b w:val="0"/>
+          <w:sz w:val="24"/>
+        </w:rPr>
+        <w:t>Загружает и просматривает файлы, формирует запросы недостающих документов.</w:t>
+      </w:r>
+    </w:p>
+    <w:p>
+      <w:pPr>
+        <w:spacing w:before="0" w:after="60"/>
+        <w:jc w:val="both"/>
+      </w:pPr>
+      <w:r>
+        <w:rPr>
+          <w:rFonts w:ascii="Times New Roman" w:hAnsi="Times New Roman" w:eastAsia="Times New Roman"/>
+          <w:b w:val="0"/>
+          <w:sz w:val="24"/>
+        </w:rPr>
+        <w:t>Контролирует исполнение запросов.</w:t>
+      </w:r>
+    </w:p>
+    <w:p>
+      <w:pPr>
+        <w:spacing w:before="200" w:after="80"/>
+        <w:jc w:val="both"/>
+      </w:pPr>
+      <w:r>
+        <w:rPr>
+          <w:rFonts w:ascii="Times New Roman" w:hAnsi="Times New Roman" w:eastAsia="Times New Roman"/>
+          <w:b/>
+          <w:sz w:val="24"/>
+        </w:rPr>
+        <w:t>17. Коммуникация в чатах</w:t>
+      </w:r>
+    </w:p>
+    <w:p>
+      <w:pPr>
+        <w:spacing w:before="0" w:after="60"/>
+        <w:jc w:val="both"/>
+      </w:pPr>
+      <w:r>
+        <w:rPr>
+          <w:rFonts w:ascii="Times New Roman" w:hAnsi="Times New Roman" w:eastAsia="Times New Roman"/>
+          <w:b w:val="0"/>
+          <w:sz w:val="24"/>
+        </w:rPr>
+        <w:t>Сотрудник открывает чат по заявке или по продукту.</w:t>
+      </w:r>
+    </w:p>
+    <w:p>
+      <w:pPr>
+        <w:spacing w:before="0" w:after="60"/>
+        <w:jc w:val="both"/>
+      </w:pPr>
+      <w:r>
+        <w:rPr>
+          <w:rFonts w:ascii="Times New Roman" w:hAnsi="Times New Roman" w:eastAsia="Times New Roman"/>
+          <w:b w:val="0"/>
+          <w:sz w:val="24"/>
+        </w:rPr>
+        <w:t>Отправляет сообщения и вложения, просматривает историю переписки.</w:t>
+      </w:r>
+    </w:p>
+    <w:p>
+      <w:pPr>
+        <w:spacing w:before="200" w:after="80"/>
+        <w:jc w:val="both"/>
+      </w:pPr>
+      <w:r>
+        <w:rPr>
+          <w:rFonts w:ascii="Times New Roman" w:hAnsi="Times New Roman" w:eastAsia="Times New Roman"/>
+          <w:b/>
+          <w:sz w:val="24"/>
+        </w:rPr>
+        <w:t>18. Отправка заявки в банк</w:t>
+      </w:r>
+    </w:p>
+    <w:p>
+      <w:pPr>
+        <w:spacing w:before="0" w:after="60"/>
+        <w:jc w:val="both"/>
+      </w:pPr>
+      <w:r>
+        <w:rPr>
+          <w:rFonts w:ascii="Times New Roman" w:hAnsi="Times New Roman" w:eastAsia="Times New Roman"/>
+          <w:b w:val="0"/>
+          <w:sz w:val="24"/>
+        </w:rPr>
+        <w:t>Сотрудник открывает раздел работы с банком по выбранному продукту.</w:t>
+      </w:r>
+    </w:p>
+    <w:p>
+      <w:pPr>
+        <w:spacing w:before="0" w:after="60"/>
+        <w:jc w:val="both"/>
+      </w:pPr>
+      <w:r>
+        <w:rPr>
+          <w:rFonts w:ascii="Times New Roman" w:hAnsi="Times New Roman" w:eastAsia="Times New Roman"/>
+          <w:b w:val="0"/>
+          <w:sz w:val="24"/>
+        </w:rPr>
+        <w:t>Формирует пакет документов и отправляет его в банк.</w:t>
+      </w:r>
+    </w:p>
+    <w:p>
+      <w:pPr>
+        <w:spacing w:before="0" w:after="60"/>
+        <w:jc w:val="both"/>
+      </w:pPr>
+      <w:r>
+        <w:rPr>
+          <w:rFonts w:ascii="Times New Roman" w:hAnsi="Times New Roman" w:eastAsia="Times New Roman"/>
+          <w:b w:val="0"/>
+          <w:sz w:val="24"/>
+        </w:rPr>
+        <w:t>Далее сопровождает статусы банковского кейса и переписку с банком.</w:t>
+      </w:r>
+    </w:p>
+    <w:p>
+      <w:pPr>
+        <w:spacing w:before="200" w:after="80"/>
+        <w:jc w:val="both"/>
+      </w:pPr>
+      <w:r>
+        <w:rPr>
+          <w:rFonts w:ascii="Times New Roman" w:hAnsi="Times New Roman" w:eastAsia="Times New Roman"/>
+          <w:b/>
+          <w:sz w:val="24"/>
+        </w:rPr>
+        <w:t>19. Работа со структурой и дорожной картой</w:t>
+      </w:r>
+    </w:p>
+    <w:p>
+      <w:pPr>
+        <w:spacing w:before="0" w:after="60"/>
+        <w:jc w:val="both"/>
+      </w:pPr>
+      <w:r>
+        <w:rPr>
+          <w:rFonts w:ascii="Times New Roman" w:hAnsi="Times New Roman" w:eastAsia="Times New Roman"/>
+          <w:b w:val="0"/>
+          <w:sz w:val="24"/>
+        </w:rPr>
+        <w:t>Сотрудник открывает вкладку структуры принципала и ведёт доступные блоки сведений.</w:t>
+      </w:r>
+    </w:p>
+    <w:p>
+      <w:pPr>
+        <w:spacing w:before="0" w:after="60"/>
+        <w:jc w:val="both"/>
+      </w:pPr>
+      <w:r>
+        <w:rPr>
+          <w:rFonts w:ascii="Times New Roman" w:hAnsi="Times New Roman" w:eastAsia="Times New Roman"/>
+          <w:b w:val="0"/>
+          <w:sz w:val="24"/>
+        </w:rPr>
+        <w:t>При наличии доступа открывает дорожную карту заявки, отмечает выполнение пунктов и добавляет необходимые разделы.</w:t>
+      </w:r>
+    </w:p>
+    <w:p>
+      <w:pPr>
+        <w:spacing w:before="200" w:after="80"/>
+        <w:jc w:val="both"/>
+      </w:pPr>
+      <w:r>
+        <w:rPr>
+          <w:rFonts w:ascii="Times New Roman" w:hAnsi="Times New Roman" w:eastAsia="Times New Roman"/>
+          <w:b/>
+          <w:sz w:val="24"/>
+        </w:rPr>
+        <w:t>20. Банковская методика</w:t>
+      </w:r>
+    </w:p>
+    <w:p>
+      <w:pPr>
+        <w:spacing w:before="0" w:after="60"/>
+        <w:jc w:val="both"/>
+      </w:pPr>
+      <w:r>
+        <w:rPr>
+          <w:rFonts w:ascii="Times New Roman" w:hAnsi="Times New Roman" w:eastAsia="Times New Roman"/>
+          <w:b w:val="0"/>
+          <w:sz w:val="24"/>
+        </w:rPr>
+        <w:t>При наличии права сотрудник открывает вкладку банковской методики в карточке заявки.</w:t>
+      </w:r>
+    </w:p>
+    <w:p>
+      <w:pPr>
+        <w:spacing w:before="0" w:after="60"/>
+        <w:jc w:val="both"/>
+      </w:pPr>
+      <w:r>
+        <w:rPr>
+          <w:rFonts w:ascii="Times New Roman" w:hAnsi="Times New Roman" w:eastAsia="Times New Roman"/>
+          <w:b w:val="0"/>
+          <w:sz w:val="24"/>
+        </w:rPr>
+        <w:t>Заполняет разделы оценки, сохраняет черновик и при необходимости фиксирует версию результата.</w:t>
+      </w:r>
+    </w:p>
+    <w:p>
+      <w:pPr>
+        <w:spacing w:before="200" w:after="80"/>
+        <w:jc w:val="both"/>
+      </w:pPr>
+      <w:r>
+        <w:rPr>
+          <w:rFonts w:ascii="Times New Roman" w:hAnsi="Times New Roman" w:eastAsia="Times New Roman"/>
+          <w:b/>
+          <w:sz w:val="24"/>
+        </w:rPr>
+        <w:t>21. Использование аналитики и инструментов</w:t>
+      </w:r>
+    </w:p>
+    <w:p>
+      <w:pPr>
+        <w:spacing w:before="0" w:after="60"/>
+        <w:jc w:val="both"/>
+      </w:pPr>
+      <w:r>
+        <w:rPr>
+          <w:rFonts w:ascii="Times New Roman" w:hAnsi="Times New Roman" w:eastAsia="Times New Roman"/>
+          <w:b w:val="0"/>
+          <w:sz w:val="24"/>
+        </w:rPr>
+        <w:t>Сотрудник использует аналитику по компании, подбор продуктов и расчёт лимитов в рамках обработки заявок.</w:t>
+      </w:r>
+    </w:p>
+    <w:p>
+      <w:pPr>
+        <w:spacing w:before="240" w:after="120"/>
+        <w:jc w:val="both"/>
+      </w:pPr>
+      <w:r>
+        <w:rPr>
+          <w:rFonts w:ascii="Times New Roman" w:hAnsi="Times New Roman" w:eastAsia="Times New Roman"/>
+          <w:b/>
+          <w:sz w:val="26"/>
+        </w:rPr>
+        <w:t>Сценарии аналитика</w:t>
+      </w:r>
+    </w:p>
+    <w:p>
+      <w:pPr>
+        <w:spacing w:before="200" w:after="80"/>
+        <w:jc w:val="both"/>
+      </w:pPr>
+      <w:r>
+        <w:rPr>
+          <w:rFonts w:ascii="Times New Roman" w:hAnsi="Times New Roman" w:eastAsia="Times New Roman"/>
+          <w:b/>
+          <w:sz w:val="24"/>
+        </w:rPr>
+        <w:t>22. Работа аналитика с заявками</w:t>
+      </w:r>
+    </w:p>
+    <w:p>
+      <w:pPr>
+        <w:spacing w:before="0" w:after="60"/>
+        <w:jc w:val="both"/>
+      </w:pPr>
+      <w:r>
+        <w:rPr>
+          <w:rFonts w:ascii="Times New Roman" w:hAnsi="Times New Roman" w:eastAsia="Times New Roman"/>
+          <w:b w:val="0"/>
+          <w:sz w:val="24"/>
+        </w:rPr>
+        <w:t>Аналитик открывает список доступных заявок.</w:t>
+      </w:r>
+    </w:p>
+    <w:p>
+      <w:pPr>
+        <w:spacing w:before="0" w:after="60"/>
+        <w:jc w:val="both"/>
+      </w:pPr>
+      <w:r>
+        <w:rPr>
+          <w:rFonts w:ascii="Times New Roman" w:hAnsi="Times New Roman" w:eastAsia="Times New Roman"/>
+          <w:b w:val="0"/>
+          <w:sz w:val="24"/>
+        </w:rPr>
+        <w:t>Открывает карточку заявки и работает с разделами анализа, структуры и документов в пределах назначенных прав.</w:t>
+      </w:r>
+    </w:p>
+    <w:p>
+      <w:pPr>
+        <w:spacing w:before="0" w:after="60"/>
+        <w:jc w:val="both"/>
+      </w:pPr>
+      <w:r>
+        <w:rPr>
+          <w:rFonts w:ascii="Times New Roman" w:hAnsi="Times New Roman" w:eastAsia="Times New Roman"/>
+          <w:b w:val="0"/>
+          <w:sz w:val="24"/>
+        </w:rPr>
+        <w:t>При наличии доступа просматривает аналитику по компании.</w:t>
+      </w:r>
+    </w:p>
+    <w:p>
+      <w:pPr>
+        <w:spacing w:before="240" w:after="120"/>
+        <w:jc w:val="both"/>
+      </w:pPr>
+      <w:r>
+        <w:rPr>
+          <w:rFonts w:ascii="Times New Roman" w:hAnsi="Times New Roman" w:eastAsia="Times New Roman"/>
+          <w:b/>
+          <w:sz w:val="26"/>
+        </w:rPr>
+        <w:t>Сценарии руководителя и администрирования</w:t>
+      </w:r>
+    </w:p>
+    <w:p>
+      <w:pPr>
+        <w:spacing w:before="200" w:after="80"/>
+        <w:jc w:val="both"/>
+      </w:pPr>
+      <w:r>
+        <w:rPr>
+          <w:rFonts w:ascii="Times New Roman" w:hAnsi="Times New Roman" w:eastAsia="Times New Roman"/>
+          <w:b/>
+          <w:sz w:val="24"/>
+        </w:rPr>
+        <w:t>23. Управление пользователями</w:t>
+      </w:r>
+    </w:p>
+    <w:p>
+      <w:pPr>
+        <w:spacing w:before="0" w:after="60"/>
+        <w:jc w:val="both"/>
+      </w:pPr>
+      <w:r>
+        <w:rPr>
+          <w:rFonts w:ascii="Times New Roman" w:hAnsi="Times New Roman" w:eastAsia="Times New Roman"/>
+          <w:b w:val="0"/>
+          <w:sz w:val="24"/>
+        </w:rPr>
+        <w:t>Уполномоченный пользователь открывает раздел пользователей.</w:t>
+      </w:r>
+    </w:p>
+    <w:p>
+      <w:pPr>
+        <w:spacing w:before="0" w:after="60"/>
+        <w:jc w:val="both"/>
+      </w:pPr>
+      <w:r>
+        <w:rPr>
+          <w:rFonts w:ascii="Times New Roman" w:hAnsi="Times New Roman" w:eastAsia="Times New Roman"/>
+          <w:b w:val="0"/>
+          <w:sz w:val="24"/>
+        </w:rPr>
+        <w:t>Создаёт и редактирует учётные записи, назначает роли и статусы активности.</w:t>
+      </w:r>
+    </w:p>
+    <w:p>
+      <w:pPr>
+        <w:spacing w:before="200" w:after="80"/>
+        <w:jc w:val="both"/>
+      </w:pPr>
+      <w:r>
+        <w:rPr>
+          <w:rFonts w:ascii="Times New Roman" w:hAnsi="Times New Roman" w:eastAsia="Times New Roman"/>
+          <w:b/>
+          <w:sz w:val="24"/>
+        </w:rPr>
+        <w:t>24. Настройка прав доступа</w:t>
+      </w:r>
+    </w:p>
+    <w:p>
+      <w:pPr>
+        <w:spacing w:before="0" w:after="60"/>
+        <w:jc w:val="both"/>
+      </w:pPr>
+      <w:r>
+        <w:rPr>
+          <w:rFonts w:ascii="Times New Roman" w:hAnsi="Times New Roman" w:eastAsia="Times New Roman"/>
+          <w:b w:val="0"/>
+          <w:sz w:val="24"/>
+        </w:rPr>
+        <w:t>Уполномоченный пользователь открывает раздел прав доступа.</w:t>
+      </w:r>
+    </w:p>
+    <w:p>
+      <w:pPr>
+        <w:spacing w:before="0" w:after="60"/>
+        <w:jc w:val="both"/>
+      </w:pPr>
+      <w:r>
+        <w:rPr>
+          <w:rFonts w:ascii="Times New Roman" w:hAnsi="Times New Roman" w:eastAsia="Times New Roman"/>
+          <w:b w:val="0"/>
+          <w:sz w:val="24"/>
+        </w:rPr>
+        <w:t>Изменяет матрицу полномочий ролей сотрудников платформы и сохраняет настройки.</w:t>
+      </w:r>
+    </w:p>
+    <w:p>
+      <w:pPr>
+        <w:spacing w:before="200" w:after="80"/>
+        <w:jc w:val="both"/>
+      </w:pPr>
+      <w:r>
+        <w:rPr>
+          <w:rFonts w:ascii="Times New Roman" w:hAnsi="Times New Roman" w:eastAsia="Times New Roman"/>
+          <w:b/>
+          <w:sz w:val="24"/>
+        </w:rPr>
+        <w:t>25. Администрирование каталога продуктов</w:t>
+      </w:r>
+    </w:p>
+    <w:p>
+      <w:pPr>
+        <w:spacing w:before="0" w:after="60"/>
+        <w:jc w:val="both"/>
+      </w:pPr>
+      <w:r>
+        <w:rPr>
+          <w:rFonts w:ascii="Times New Roman" w:hAnsi="Times New Roman" w:eastAsia="Times New Roman"/>
+          <w:b w:val="0"/>
+          <w:sz w:val="24"/>
+        </w:rPr>
+        <w:t>Уполномоченный пользователь открывает раздел продуктов.</w:t>
+      </w:r>
+    </w:p>
+    <w:p>
+      <w:pPr>
+        <w:spacing w:before="0" w:after="60"/>
+        <w:jc w:val="both"/>
+      </w:pPr>
+      <w:r>
+        <w:rPr>
+          <w:rFonts w:ascii="Times New Roman" w:hAnsi="Times New Roman" w:eastAsia="Times New Roman"/>
+          <w:b w:val="0"/>
+          <w:sz w:val="24"/>
+        </w:rPr>
+        <w:t>Добавляет и редактирует банковские продукты и их параметры.</w:t>
+      </w:r>
+    </w:p>
+    <w:p>
+      <w:pPr>
+        <w:spacing w:before="200" w:after="80"/>
+        <w:jc w:val="both"/>
+      </w:pPr>
+      <w:r>
+        <w:rPr>
+          <w:rFonts w:ascii="Times New Roman" w:hAnsi="Times New Roman" w:eastAsia="Times New Roman"/>
+          <w:b/>
+          <w:sz w:val="24"/>
+        </w:rPr>
+        <w:t>26. Просмотр статистики</w:t>
+      </w:r>
+    </w:p>
+    <w:p>
+      <w:pPr>
+        <w:spacing w:before="0" w:after="60"/>
+        <w:jc w:val="both"/>
+      </w:pPr>
+      <w:r>
+        <w:rPr>
+          <w:rFonts w:ascii="Times New Roman" w:hAnsi="Times New Roman" w:eastAsia="Times New Roman"/>
+          <w:b w:val="0"/>
+          <w:sz w:val="24"/>
+        </w:rPr>
+        <w:t>Уполномоченный пользователь открывает раздел статистики.</w:t>
+      </w:r>
+    </w:p>
+    <w:p>
+      <w:pPr>
+        <w:spacing w:before="0" w:after="60"/>
+        <w:jc w:val="both"/>
+      </w:pPr>
+      <w:r>
+        <w:rPr>
+          <w:rFonts w:ascii="Times New Roman" w:hAnsi="Times New Roman" w:eastAsia="Times New Roman"/>
+          <w:b w:val="0"/>
+          <w:sz w:val="24"/>
+        </w:rPr>
+        <w:t>Просматривает сводные показатели по заявкам за выбранный период.</w:t>
+      </w:r>
+    </w:p>
+    <w:p>
+      <w:pPr>
+        <w:spacing w:before="240" w:after="120"/>
+        <w:jc w:val="both"/>
+      </w:pPr>
+      <w:r>
+        <w:rPr>
+          <w:rFonts w:ascii="Times New Roman" w:hAnsi="Times New Roman" w:eastAsia="Times New Roman"/>
+          <w:b/>
+          <w:sz w:val="26"/>
+        </w:rPr>
+        <w:t>Сценарии пользователя банка</w:t>
+      </w:r>
+    </w:p>
+    <w:p>
+      <w:pPr>
+        <w:spacing w:before="200" w:after="80"/>
+        <w:jc w:val="both"/>
+      </w:pPr>
+      <w:r>
+        <w:rPr>
+          <w:rFonts w:ascii="Times New Roman" w:hAnsi="Times New Roman" w:eastAsia="Times New Roman"/>
+          <w:b/>
+          <w:sz w:val="24"/>
+        </w:rPr>
+        <w:t>27. Вход в личный кабинет банка и список заявок</w:t>
+      </w:r>
+    </w:p>
+    <w:p>
+      <w:pPr>
+        <w:spacing w:before="0" w:after="60"/>
+        <w:jc w:val="both"/>
+      </w:pPr>
+      <w:r>
+        <w:rPr>
+          <w:rFonts w:ascii="Times New Roman" w:hAnsi="Times New Roman" w:eastAsia="Times New Roman"/>
+          <w:b w:val="0"/>
+          <w:sz w:val="24"/>
+        </w:rPr>
+        <w:t>Пользователь банка входит в систему и открывает список заявок своего банковского кабинета.</w:t>
+      </w:r>
+    </w:p>
+    <w:p>
+      <w:pPr>
+        <w:spacing w:before="0" w:after="60"/>
+        <w:jc w:val="both"/>
+      </w:pPr>
+      <w:r>
+        <w:rPr>
+          <w:rFonts w:ascii="Times New Roman" w:hAnsi="Times New Roman" w:eastAsia="Times New Roman"/>
+          <w:b w:val="0"/>
+          <w:sz w:val="24"/>
+        </w:rPr>
+        <w:t>Видит поступившие заявки и их статусы.</w:t>
+      </w:r>
+    </w:p>
+    <w:p>
+      <w:pPr>
+        <w:spacing w:before="0" w:after="60"/>
+        <w:jc w:val="both"/>
+      </w:pPr>
+      <w:r>
+        <w:rPr>
+          <w:rFonts w:ascii="Times New Roman" w:hAnsi="Times New Roman" w:eastAsia="Times New Roman"/>
+          <w:b w:val="0"/>
+          <w:sz w:val="24"/>
+        </w:rPr>
+        <w:t>Открывает карточку выбранной заявки.</w:t>
+      </w:r>
+    </w:p>
+    <w:p>
+      <w:pPr>
+        <w:spacing w:before="200" w:after="80"/>
+        <w:jc w:val="both"/>
+      </w:pPr>
+      <w:r>
+        <w:rPr>
+          <w:rFonts w:ascii="Times New Roman" w:hAnsi="Times New Roman" w:eastAsia="Times New Roman"/>
+          <w:b/>
+          <w:sz w:val="24"/>
+        </w:rPr>
+        <w:t>28. Просмотр заявки в кабинете банка</w:t>
+      </w:r>
+    </w:p>
+    <w:p>
+      <w:pPr>
+        <w:spacing w:before="0" w:after="60"/>
+        <w:jc w:val="both"/>
+      </w:pPr>
+      <w:r>
+        <w:rPr>
+          <w:rFonts w:ascii="Times New Roman" w:hAnsi="Times New Roman" w:eastAsia="Times New Roman"/>
+          <w:b w:val="0"/>
+          <w:sz w:val="24"/>
+        </w:rPr>
+        <w:t>В карточке заявки банк переключается между доступными вкладками.</w:t>
+      </w:r>
+    </w:p>
+    <w:p>
+      <w:pPr>
+        <w:spacing w:before="0" w:after="60"/>
+        <w:jc w:val="both"/>
+      </w:pPr>
+      <w:r>
+        <w:rPr>
+          <w:rFonts w:ascii="Times New Roman" w:hAnsi="Times New Roman" w:eastAsia="Times New Roman"/>
+          <w:b w:val="0"/>
+          <w:sz w:val="24"/>
+        </w:rPr>
+        <w:t>Просматривает сведения заявки, пакет документов, аналитику и структуру.</w:t>
+      </w:r>
+    </w:p>
+    <w:p>
+      <w:pPr>
+        <w:spacing w:before="0" w:after="60"/>
+        <w:jc w:val="both"/>
+      </w:pPr>
+      <w:r>
+        <w:rPr>
+          <w:rFonts w:ascii="Times New Roman" w:hAnsi="Times New Roman" w:eastAsia="Times New Roman"/>
+          <w:b w:val="0"/>
+          <w:sz w:val="24"/>
+        </w:rPr>
+        <w:t>При необходимости выгружает документы.</w:t>
+      </w:r>
+    </w:p>
+    <w:p>
+      <w:pPr>
+        <w:spacing w:before="200" w:after="80"/>
+        <w:jc w:val="both"/>
+      </w:pPr>
+      <w:r>
+        <w:rPr>
+          <w:rFonts w:ascii="Times New Roman" w:hAnsi="Times New Roman" w:eastAsia="Times New Roman"/>
+          <w:b/>
+          <w:sz w:val="24"/>
+        </w:rPr>
+        <w:t>29. Изменение статуса рассмотрения</w:t>
+      </w:r>
+    </w:p>
+    <w:p>
+      <w:pPr>
+        <w:spacing w:before="0" w:after="60"/>
+        <w:jc w:val="both"/>
+      </w:pPr>
+      <w:r>
+        <w:rPr>
+          <w:rFonts w:ascii="Times New Roman" w:hAnsi="Times New Roman" w:eastAsia="Times New Roman"/>
+          <w:b w:val="0"/>
+          <w:sz w:val="24"/>
+        </w:rPr>
+        <w:t>Банк выбирает новый статус заявки в кабинете банка.</w:t>
+      </w:r>
+    </w:p>
+    <w:p>
+      <w:pPr>
+        <w:spacing w:before="0" w:after="60"/>
+        <w:jc w:val="both"/>
+      </w:pPr>
+      <w:r>
+        <w:rPr>
+          <w:rFonts w:ascii="Times New Roman" w:hAnsi="Times New Roman" w:eastAsia="Times New Roman"/>
+          <w:b w:val="0"/>
+          <w:sz w:val="24"/>
+        </w:rPr>
+        <w:t>При необходимости указывает комментарий и прикладывает файлы.</w:t>
+      </w:r>
+    </w:p>
+    <w:p>
+      <w:pPr>
+        <w:spacing w:before="0" w:after="60"/>
+        <w:jc w:val="both"/>
+      </w:pPr>
+      <w:r>
+        <w:rPr>
+          <w:rFonts w:ascii="Times New Roman" w:hAnsi="Times New Roman" w:eastAsia="Times New Roman"/>
+          <w:b w:val="0"/>
+          <w:sz w:val="24"/>
+        </w:rPr>
+        <w:t>Система фиксирует изменение статуса и отображает его в истории.</w:t>
+      </w:r>
+    </w:p>
+    <w:p>
+      <w:pPr>
+        <w:spacing w:before="200" w:after="80"/>
+        <w:jc w:val="both"/>
+      </w:pPr>
+      <w:r>
+        <w:rPr>
+          <w:rFonts w:ascii="Times New Roman" w:hAnsi="Times New Roman" w:eastAsia="Times New Roman"/>
+          <w:b/>
+          <w:sz w:val="24"/>
+        </w:rPr>
+        <w:t>30. Переписка с менеджером</w:t>
+      </w:r>
+    </w:p>
+    <w:p>
+      <w:pPr>
+        <w:spacing w:before="0" w:after="60"/>
+        <w:jc w:val="both"/>
+      </w:pPr>
+      <w:r>
+        <w:rPr>
+          <w:rFonts w:ascii="Times New Roman" w:hAnsi="Times New Roman" w:eastAsia="Times New Roman"/>
+          <w:b w:val="0"/>
+          <w:sz w:val="24"/>
+        </w:rPr>
+        <w:t>Банк открывает чат по заявке.</w:t>
+      </w:r>
+    </w:p>
+    <w:p>
+      <w:pPr>
+        <w:spacing w:before="0" w:after="60"/>
+        <w:jc w:val="both"/>
+      </w:pPr>
+      <w:r>
+        <w:rPr>
+          <w:rFonts w:ascii="Times New Roman" w:hAnsi="Times New Roman" w:eastAsia="Times New Roman"/>
+          <w:b w:val="0"/>
+          <w:sz w:val="24"/>
+        </w:rPr>
+        <w:t>Отправляет сообщения и вложения, просматривает ответы менеджера.</w:t>
+      </w:r>
+    </w:p>
+    <w:p>
+      <w:pPr>
+        <w:spacing w:before="200" w:after="80"/>
+        <w:jc w:val="both"/>
+      </w:pPr>
+      <w:r>
+        <w:rPr>
+          <w:rFonts w:ascii="Times New Roman" w:hAnsi="Times New Roman" w:eastAsia="Times New Roman"/>
+          <w:b/>
+          <w:sz w:val="24"/>
+        </w:rPr>
+        <w:t>31. Банковская методика в кабинете банка</w:t>
+      </w:r>
+    </w:p>
+    <w:p>
+      <w:pPr>
+        <w:spacing w:before="0" w:after="60"/>
+        <w:jc w:val="both"/>
+      </w:pPr>
+      <w:r>
+        <w:rPr>
+          <w:rFonts w:ascii="Times New Roman" w:hAnsi="Times New Roman" w:eastAsia="Times New Roman"/>
+          <w:b w:val="0"/>
+          <w:sz w:val="24"/>
+        </w:rPr>
+        <w:t>При наличии настройки портала банка пользователь открывает вкладку банковской методики.</w:t>
+      </w:r>
+    </w:p>
+    <w:p>
+      <w:pPr>
+        <w:spacing w:before="0" w:after="60"/>
+        <w:jc w:val="both"/>
+      </w:pPr>
+      <w:r>
+        <w:rPr>
+          <w:rFonts w:ascii="Times New Roman" w:hAnsi="Times New Roman" w:eastAsia="Times New Roman"/>
+          <w:b w:val="0"/>
+          <w:sz w:val="24"/>
+        </w:rPr>
+        <w:t>Заполняет разделы оценки, сохраняет черновик и при необходимости фиксирует результат.</w:t>
+      </w:r>
+    </w:p>
+    <w:p>
+      <w:pPr>
+        <w:spacing w:before="240" w:after="120"/>
+        <w:jc w:val="both"/>
+      </w:pPr>
+      <w:r>
+        <w:rPr>
+          <w:rFonts w:ascii="Times New Roman" w:hAnsi="Times New Roman" w:eastAsia="Times New Roman"/>
           <w:b/>
           <w:sz w:val="28"/>
         </w:rPr>
@@ -1297,12 +2562,12 @@
     </w:p>
     <w:p>
       <w:pPr>
-        <w:spacing w:after="60"/>
+        <w:spacing w:before="0" w:after="60"/>
         <w:jc w:val="both"/>
       </w:pPr>
       <w:r>
         <w:rPr>
-          <w:rFonts w:ascii="Arial" w:hAnsi="Arial" w:eastAsia="Arial"/>
+          <w:rFonts w:ascii="Times New Roman" w:hAnsi="Times New Roman" w:eastAsia="Times New Roman"/>
           <w:b w:val="0"/>
           <w:sz w:val="24"/>
         </w:rPr>
@@ -1315,7 +2580,7 @@
       </w:pPr>
       <w:r>
         <w:rPr>
-          <w:rFonts w:ascii="Arial" w:hAnsi="Arial" w:eastAsia="Arial"/>
+          <w:rFonts w:ascii="Times New Roman" w:hAnsi="Times New Roman" w:eastAsia="Times New Roman"/>
           <w:b/>
           <w:sz w:val="24"/>
         </w:rPr>
@@ -1323,7 +2588,8 @@
       </w:r>
       <w:r>
         <w:rPr>
-          <w:rFonts w:ascii="Arial" w:hAnsi="Arial" w:eastAsia="Arial"/>
+          <w:rFonts w:ascii="Times New Roman" w:hAnsi="Times New Roman" w:eastAsia="Times New Roman"/>
+          <w:b w:val="0"/>
           <w:sz w:val="24"/>
         </w:rPr>
         <w:t>info@p-fg.com</w:t>
@@ -1702,11 +2968,8 @@
     <w:name w:val="Normal"/>
     <w:qFormat/>
     <w:rsid w:val="00FC693F"/>
-    <w:pPr>
-      <w:spacing w:after="0" w:before="0" w:line="240" w:lineRule="auto"/>
-    </w:pPr>
     <w:rPr>
-      <w:rFonts w:ascii="Arial" w:hAnsi="Arial" w:eastAsia="Arial"/>
+      <w:rFonts w:ascii="Times New Roman" w:hAnsi="Times New Roman" w:eastAsia="Times New Roman"/>
       <w:sz w:val="24"/>
     </w:rPr>
   </w:style>

</xml_diff>